<commit_message>
update signoff datasheet and paper for the three arm chip
</commit_message>
<xml_diff>
--- a/docs/paper/SILICON_paper.docx
+++ b/docs/paper/SILICON_paper.docx
@@ -2,7 +2,7 @@
 <file path=word/document.xml><?xml version="1.0" encoding="utf-8"?>
 <w:document xmlns:w="http://schemas.openxmlformats.org/wordprocessingml/2006/main" xmlns:m="http://schemas.openxmlformats.org/officeDocument/2006/math" xmlns:r="http://schemas.openxmlformats.org/officeDocument/2006/relationships" xmlns:o="urn:schemas-microsoft-com:office:office" xmlns:v="urn:schemas-microsoft-com:vml" xmlns:w10="urn:schemas-microsoft-com:office:word" xmlns:a="http://schemas.openxmlformats.org/drawingml/2006/main" xmlns:pic="http://schemas.openxmlformats.org/drawingml/2006/picture" xmlns:wp="http://schemas.openxmlformats.org/drawingml/2006/wordprocessingDrawing">
   <w:body>
-    <w:bookmarkStart w:id="68" w:name="X74bce0fbac609bebd1ffcca8719176bd91ecfa9"/>
+    <w:bookmarkStart w:id="72" w:name="X74bce0fbac609bebd1ffcca8719176bd91ecfa9"/>
     <w:p>
       <w:pPr>
         <w:pStyle w:val="Heading1"/>
@@ -34,7 +34,57 @@
         <w:pStyle w:val="BodyText"/>
       </w:pPr>
       <w:r>
-        <w:t xml:space="preserve">Draft, 2026-07-30</w:t>
+        <w:t xml:space="preserve">Draft, 2026-07-30, revised 2026-09-21</w:t>
+      </w:r>
+    </w:p>
+    <w:p>
+      <w:pPr>
+        <w:pStyle w:val="BodyText"/>
+      </w:pPr>
+      <w:r>
+        <w:t xml:space="preserve">A note on the revision. This draft was written about a two-arm version of the</w:t>
+      </w:r>
+      <w:r>
+        <w:t xml:space="preserve"> </w:t>
+      </w:r>
+      <w:r>
+        <w:t xml:space="preserve">design. The chip going to the shuttle is a later build of it with three arms:</w:t>
+      </w:r>
+      <w:r>
+        <w:t xml:space="preserve"> </w:t>
+      </w:r>
+      <w:r>
+        <w:t xml:space="preserve">the same sixteen automatically placed oscillators at the same coordinates, the</w:t>
+      </w:r>
+      <w:r>
+        <w:t xml:space="preserve"> </w:t>
+      </w:r>
+      <w:r>
+        <w:t xml:space="preserve">same sixteen macros, and a third arm of sixteen rings placed by hand. The</w:t>
+      </w:r>
+      <w:r>
+        <w:t xml:space="preserve"> </w:t>
+      </w:r>
+      <w:r>
+        <w:t xml:space="preserve">router wired that build again, and two of Arm A’s eight bits came out the</w:t>
+      </w:r>
+      <w:r>
+        <w:t xml:space="preserve"> </w:t>
+      </w:r>
+      <w:r>
+        <w:t xml:space="preserve">other way. The abstract and Section 7.4 give the release build’s numbers.</w:t>
+      </w:r>
+      <w:r>
+        <w:t xml:space="preserve"> </w:t>
+      </w:r>
+      <w:r>
+        <w:t xml:space="preserve">Everything else was measured on the two-arm build, which this revision calls</w:t>
+      </w:r>
+      <w:r>
+        <w:t xml:space="preserve"> </w:t>
+      </w:r>
+      <w:r>
+        <w:t xml:space="preserve">the baseline, and has not been repeated.</w:t>
       </w:r>
     </w:p>
     <w:p>
@@ -118,57 +168,119 @@
         <w:pStyle w:val="BodyText"/>
       </w:pPr>
       <w:r>
-        <w:t xml:space="preserve">For the design taped out here, not much. Arm A of the shipped build forms eight</w:t>
-      </w:r>
-      <w:r>
-        <w:t xml:space="preserve"> </w:t>
-      </w:r>
-      <w:r>
-        <w:t xml:space="preserve">response bits by comparing neighbouring oscillators. Under a first-order</w:t>
-      </w:r>
-      <w:r>
-        <w:t xml:space="preserve"> </w:t>
-      </w:r>
-      <w:r>
-        <w:t xml:space="preserve">mismatch estimate of 0.062% per ring, six of those eight carry under a</w:t>
-      </w:r>
-      <w:r>
-        <w:t xml:space="preserve"> </w:t>
-      </w:r>
-      <w:r>
-        <w:t xml:space="preserve">hundredth of a bit of across-die entropy, the arm holds 0.46 bits out of 8, and</w:t>
-      </w:r>
-      <w:r>
-        <w:t xml:space="preserve"> </w:t>
-      </w:r>
-      <w:r>
-        <w:t xml:space="preserve">someone with nothing but the public design files would call 7.91 of the 8</w:t>
-      </w:r>
-      <w:r>
-        <w:t xml:space="preserve"> </w:t>
-      </w:r>
-      <w:r>
-        <w:t xml:space="preserve">correctly on average.</w:t>
-      </w:r>
-    </w:p>
-    <w:p>
-      <w:pPr>
-        <w:pStyle w:val="BodyText"/>
-      </w:pPr>
-      <w:r>
-        <w:t xml:space="preserve">Moving the mismatch estimate to the ends of its sampling interval gives 0.30 to</w:t>
-      </w:r>
-      <w:r>
-        <w:t xml:space="preserve"> </w:t>
-      </w:r>
-      <w:r>
-        <w:t xml:space="preserve">0.69 bits and 7.84 to 7.95 bits guessed, so the conclusion does not rest on the</w:t>
-      </w:r>
-      <w:r>
-        <w:t xml:space="preserve"> </w:t>
-      </w:r>
-      <w:r>
-        <w:t xml:space="preserve">exact figure.</w:t>
+        <w:t xml:space="preserve">For the design going to fabrication here, almost none. Arm A of the release</w:t>
+      </w:r>
+      <w:r>
+        <w:t xml:space="preserve"> </w:t>
+      </w:r>
+      <w:r>
+        <w:t xml:space="preserve">build forms eight response bits by comparing neighbouring oscillators. Under a</w:t>
+      </w:r>
+      <w:r>
+        <w:t xml:space="preserve"> </w:t>
+      </w:r>
+      <w:r>
+        <w:t xml:space="preserve">first-order mismatch estimate of 0.062% per ring, seven of those eight carry</w:t>
+      </w:r>
+      <w:r>
+        <w:t xml:space="preserve"> </w:t>
+      </w:r>
+      <w:r>
+        <w:t xml:space="preserve">under a hundredth of a bit of across-die entropy, the arm holds 0.07 bits out</w:t>
+      </w:r>
+      <w:r>
+        <w:t xml:space="preserve"> </w:t>
+      </w:r>
+      <w:r>
+        <w:t xml:space="preserve">of 8, and someone with nothing but the public design files would call 7.99 of</w:t>
+      </w:r>
+      <w:r>
+        <w:t xml:space="preserve"> </w:t>
+      </w:r>
+      <w:r>
+        <w:t xml:space="preserve">the 8 correctly on average. On the two-arm baseline where the method was</w:t>
+      </w:r>
+      <w:r>
+        <w:t xml:space="preserve"> </w:t>
+      </w:r>
+      <w:r>
+        <w:t xml:space="preserve">worked out, same cells at the same coordinates and different wires, the same</w:t>
+      </w:r>
+      <w:r>
+        <w:t xml:space="preserve"> </w:t>
+      </w:r>
+      <w:r>
+        <w:t xml:space="preserve">count gives 0.46 bits and 7.91.</w:t>
+      </w:r>
+    </w:p>
+    <w:p>
+      <w:pPr>
+        <w:pStyle w:val="BodyText"/>
+      </w:pPr>
+      <w:r>
+        <w:t xml:space="preserve">Moving the mismatch estimate to the ends of its sampling interval gives 0.02 to</w:t>
+      </w:r>
+      <w:r>
+        <w:t xml:space="preserve"> </w:t>
+      </w:r>
+      <w:r>
+        <w:t xml:space="preserve">0.22 bits and 7.97 to 8.00 bits guessed on the release build, and 0.30 to 0.69</w:t>
+      </w:r>
+      <w:r>
+        <w:t xml:space="preserve"> </w:t>
+      </w:r>
+      <w:r>
+        <w:t xml:space="preserve">and 7.84 to 7.95 on the baseline, so the conclusion does not rest on the exact</w:t>
+      </w:r>
+      <w:r>
+        <w:t xml:space="preserve"> </w:t>
+      </w:r>
+      <w:r>
+        <w:t xml:space="preserve">figure.</w:t>
+      </w:r>
+    </w:p>
+    <w:p>
+      <w:pPr>
+        <w:pStyle w:val="BodyText"/>
+      </w:pPr>
+      <w:r>
+        <w:t xml:space="preserve">The release build adds a third arm, sixteen rings placed by hand from one</w:t>
+      </w:r>
+      <w:r>
+        <w:t xml:space="preserve"> </w:t>
+      </w:r>
+      <w:r>
+        <w:t xml:space="preserve">template with the routing left to the flow. Its frequencies spread 2.19% peak</w:t>
+      </w:r>
+      <w:r>
+        <w:t xml:space="preserve"> </w:t>
+      </w:r>
+      <w:r>
+        <w:t xml:space="preserve">to peak against 5.88% for Arm A on the same die, and it still holds 0.00 bits</w:t>
+      </w:r>
+      <w:r>
+        <w:t xml:space="preserve"> </w:t>
+      </w:r>
+      <w:r>
+        <w:t xml:space="preserve">of 8, because its closest pair is 3.7 mismatch standard deviations apart.</w:t>
+      </w:r>
+      <w:r>
+        <w:t xml:space="preserve"> </w:t>
+      </w:r>
+      <w:r>
+        <w:t xml:space="preserve">Fixing the placement takes out about two thirds of the spread and none of the</w:t>
+      </w:r>
+      <w:r>
+        <w:t xml:space="preserve"> </w:t>
+      </w:r>
+      <w:r>
+        <w:t xml:space="preserve">predictability. The rest of this abstract, like most of the paper, is about the</w:t>
+      </w:r>
+      <w:r>
+        <w:t xml:space="preserve"> </w:t>
+      </w:r>
+      <w:r>
+        <w:t xml:space="preserve">baseline.</w:t>
       </w:r>
     </w:p>
     <w:p>
@@ -182,25 +294,25 @@
         <w:t xml:space="preserve"> </w:t>
       </w:r>
       <w:r>
-        <w:t xml:space="preserve">reach this effect. Scored by leave-one-out cross validation against the shipped</w:t>
-      </w:r>
-      <w:r>
-        <w:t xml:space="preserve"> </w:t>
-      </w:r>
-      <w:r>
-        <w:t xml:space="preserve">build’s full RC frequencies, a quadratic surface in x and y comes out 20.0%</w:t>
-      </w:r>
-      <w:r>
-        <w:t xml:space="preserve"> </w:t>
-      </w:r>
-      <w:r>
-        <w:t xml:space="preserve">worse than leaving the data alone, because a per-instance routing fingerprint</w:t>
-      </w:r>
-      <w:r>
-        <w:t xml:space="preserve"> </w:t>
-      </w:r>
-      <w:r>
-        <w:t xml:space="preserve">has no smooth spatial surface under it.</w:t>
+        <w:t xml:space="preserve">reach this effect. Scored by leave-one-out cross validation against the</w:t>
+      </w:r>
+      <w:r>
+        <w:t xml:space="preserve"> </w:t>
+      </w:r>
+      <w:r>
+        <w:t xml:space="preserve">baseline build’s full RC frequencies, a quadratic surface in x and y comes out</w:t>
+      </w:r>
+      <w:r>
+        <w:t xml:space="preserve"> </w:t>
+      </w:r>
+      <w:r>
+        <w:t xml:space="preserve">20.0% worse than leaving the data alone, because a per-instance routing</w:t>
+      </w:r>
+      <w:r>
+        <w:t xml:space="preserve"> </w:t>
+      </w:r>
+      <w:r>
+        <w:t xml:space="preserve">fingerprint has no smooth spatial surface under it.</w:t>
       </w:r>
     </w:p>
     <w:p>
@@ -292,13 +404,13 @@
         <w:t xml:space="preserve"> </w:t>
       </w:r>
       <w:r>
-        <w:t xml:space="preserve">sixteen rings split into eight pairs 2,027,025 ways and the shipped design uses</w:t>
-      </w:r>
-      <w:r>
-        <w:t xml:space="preserve"> </w:t>
-      </w:r>
-      <w:r>
-        <w:t xml:space="preserve">the order its generate loop produced. Enumerating all of them, the best pairing</w:t>
+        <w:t xml:space="preserve">sixteen rings split into eight pairs 2,027,025 ways and the design uses the</w:t>
+      </w:r>
+      <w:r>
+        <w:t xml:space="preserve"> </w:t>
+      </w:r>
+      <w:r>
+        <w:t xml:space="preserve">order its generate loop produced. Enumerating all of them, the best pairing</w:t>
       </w:r>
       <w:r>
         <w:t xml:space="preserve"> </w:t>
@@ -380,19 +492,25 @@
         <w:t xml:space="preserve"> </w:t>
       </w:r>
       <w:r>
-        <w:t xml:space="preserve">refitted removes 88.2% of the shipped build’s spread against 89.5% for a</w:t>
-      </w:r>
-      <w:r>
-        <w:t xml:space="preserve"> </w:t>
-      </w:r>
-      <w:r>
-        <w:t xml:space="preserve">corrector fitted on the shipped build itself, and calls all eight bits the same</w:t>
-      </w:r>
-      <w:r>
-        <w:t xml:space="preserve"> </w:t>
-      </w:r>
-      <w:r>
-        <w:t xml:space="preserve">way, so the reader needs the target’s extraction and not a simulation of it.</w:t>
+        <w:t xml:space="preserve">refitted removes 88.2% of the baseline build’s spread against 89.5% for a</w:t>
+      </w:r>
+      <w:r>
+        <w:t xml:space="preserve"> </w:t>
+      </w:r>
+      <w:r>
+        <w:t xml:space="preserve">corrector fitted on the baseline build itself, and calls all eight bits the</w:t>
+      </w:r>
+      <w:r>
+        <w:t xml:space="preserve"> </w:t>
+      </w:r>
+      <w:r>
+        <w:t xml:space="preserve">same way, so the reader needs the target’s extraction and not a simulation of</w:t>
+      </w:r>
+      <w:r>
+        <w:t xml:space="preserve"> </w:t>
+      </w:r>
+      <w:r>
+        <w:t xml:space="preserve">it.</w:t>
       </w:r>
     </w:p>
     <w:p>
@@ -1090,7 +1208,7 @@
       </w:r>
     </w:p>
     <w:bookmarkEnd w:id="22"/>
-    <w:bookmarkStart w:id="26" w:name="design-under-test"/>
+    <w:bookmarkStart w:id="29" w:name="design-under-test"/>
     <w:p>
       <w:pPr>
         <w:pStyle w:val="Heading2"/>
@@ -1104,7 +1222,7 @@
         <w:pStyle w:val="FirstParagraph"/>
       </w:pPr>
       <w:r>
-        <w:t xml:space="preserve">The candidate design,</w:t>
+        <w:t xml:space="preserve">The design,</w:t>
       </w:r>
       <w:r>
         <w:t xml:space="preserve"> </w:t>
@@ -1116,25 +1234,31 @@
         <w:t xml:space="preserve">tt_um_nikodemetrashvili20_ro_puf</w:t>
       </w:r>
       <w:r>
-        <w:t xml:space="preserve">, occupies a</w:t>
-      </w:r>
-      <w:r>
-        <w:t xml:space="preserve"> </w:t>
-      </w:r>
-      <w:r>
-        <w:t xml:space="preserve">TinyTapeout 2x2 tile. It holds two 16-oscillator arms and a shared serial</w:t>
-      </w:r>
-      <w:r>
-        <w:t xml:space="preserve"> </w:t>
-      </w:r>
-      <w:r>
-        <w:t xml:space="preserve">measurement core that enables one oscillator at a time and counts its edges</w:t>
-      </w:r>
-      <w:r>
-        <w:t xml:space="preserve"> </w:t>
-      </w:r>
-      <w:r>
-        <w:t xml:space="preserve">over a fixed window.</w:t>
+        <w:t xml:space="preserve">, occupies a TinyTapeout 2x2</w:t>
+      </w:r>
+      <w:r>
+        <w:t xml:space="preserve"> </w:t>
+      </w:r>
+      <w:r>
+        <w:t xml:space="preserve">tile. In the baseline form this paper measures, it holds two 16-oscillator</w:t>
+      </w:r>
+      <w:r>
+        <w:t xml:space="preserve"> </w:t>
+      </w:r>
+      <w:r>
+        <w:t xml:space="preserve">arms and a shared serial measurement core that enables one oscillator at a</w:t>
+      </w:r>
+      <w:r>
+        <w:t xml:space="preserve"> </w:t>
+      </w:r>
+      <w:r>
+        <w:t xml:space="preserve">time and counts its edges over a fixed window. The build going to the shuttle</w:t>
+      </w:r>
+      <w:r>
+        <w:t xml:space="preserve"> </w:t>
+      </w:r>
+      <w:r>
+        <w:t xml:space="preserve">adds a third arm, described at the end of this section.</w:t>
       </w:r>
     </w:p>
     <w:p>
@@ -1192,7 +1316,7 @@
           <wp:inline>
             <wp:extent cx="5334000" cy="2712638"/>
             <wp:effectExtent b="0" l="0" r="0" t="0"/>
-            <wp:docPr descr="Figure 1. Block diagram of the two-arm design. Arm A lets the flow place and route each oscillator separately; Arm B repeats one hardened macro with a common internal layout." title="" id="24" name="Picture"/>
+            <wp:docPr descr="Figure 1. Block diagram of the two-arm baseline. Arm A lets the flow place and route each oscillator separately; Arm B repeats one hardened macro with a common internal layout." title="" id="24" name="Picture"/>
             <a:graphic>
               <a:graphicData uri="http://schemas.openxmlformats.org/drawingml/2006/picture">
                 <pic:pic>
@@ -1235,7 +1359,7 @@
         <w:pStyle w:val="ImageCaption"/>
       </w:pPr>
       <w:r>
-        <w:t xml:space="preserve">Figure 1. Block diagram of the two-arm design. Arm A lets the flow place and route each oscillator separately; Arm B repeats one hardened macro with a common internal layout.</w:t>
+        <w:t xml:space="preserve">Figure 1. Block diagram of the two-arm baseline. Arm A lets the flow place and route each oscillator separately; Arm B repeats one hardened macro with a common internal layout.</w:t>
       </w:r>
     </w:p>
     <w:p>
@@ -1588,7 +1712,7 @@
         <w:t xml:space="preserve"> </w:t>
       </w:r>
       <w:r>
-        <w:t xml:space="preserve">power grid, so the shipped arrangement is the one that leaves the automatically</w:t>
+        <w:t xml:space="preserve">power grid, so the arrangement used is the one that leaves the automatically</w:t>
       </w:r>
       <w:r>
         <w:t xml:space="preserve"> </w:t>
@@ -1687,25 +1811,25 @@
         <w:pStyle w:val="BodyText"/>
       </w:pPr>
       <w:r>
-        <w:t xml:space="preserve">The main results below come from a coherent build of the current</w:t>
-      </w:r>
-      <w:r>
-        <w:t xml:space="preserve"> </w:t>
-      </w:r>
-      <w:r>
-        <w:t xml:space="preserve">RTL that passes the physical checks (Magic and KLayout DRC, XOR, LVS, antenna,</w:t>
-      </w:r>
-      <w:r>
-        <w:t xml:space="preserve"> </w:t>
-      </w:r>
-      <w:r>
-        <w:t xml:space="preserve">detailed route, power grid) with zero violations; two earlier builds, an</w:t>
-      </w:r>
-      <w:r>
-        <w:t xml:space="preserve"> </w:t>
-      </w:r>
-      <w:r>
-        <w:t xml:space="preserve">archived dual-arm snapshot and a 32-oscillator layout, are reported for</w:t>
+        <w:t xml:space="preserve">The main results below come from a coherent build of the two-arm RTL, the</w:t>
+      </w:r>
+      <w:r>
+        <w:t xml:space="preserve"> </w:t>
+      </w:r>
+      <w:r>
+        <w:t xml:space="preserve">baseline, that passes the physical checks (Magic and KLayout DRC, XOR, LVS,</w:t>
+      </w:r>
+      <w:r>
+        <w:t xml:space="preserve"> </w:t>
+      </w:r>
+      <w:r>
+        <w:t xml:space="preserve">antenna, detailed route, power grid) with zero violations; two earlier builds,</w:t>
+      </w:r>
+      <w:r>
+        <w:t xml:space="preserve"> </w:t>
+      </w:r>
+      <w:r>
+        <w:t xml:space="preserve">an archived dual-arm snapshot and a 32-oscillator layout, are reported for</w:t>
       </w:r>
       <w:r>
         <w:t xml:space="preserve"> </w:t>
@@ -1714,8 +1838,139 @@
         <w:t xml:space="preserve">contrast (see SIGNOFF.md in the repository).</w:t>
       </w:r>
     </w:p>
-    <w:bookmarkEnd w:id="26"/>
-    <w:bookmarkStart w:id="27" w:name="method"/>
+    <w:p>
+      <w:pPr>
+        <w:pStyle w:val="BodyText"/>
+      </w:pPr>
+      <w:r>
+        <w:t xml:space="preserve">The build going to the shuttle is a later one of the same source with a third</w:t>
+      </w:r>
+      <w:r>
+        <w:t xml:space="preserve"> </w:t>
+      </w:r>
+      <w:r>
+        <w:t xml:space="preserve">arm added. Arm C uses the same 31-stage ring in standard cells, sixteen copies</w:t>
+      </w:r>
+      <w:r>
+        <w:t xml:space="preserve"> </w:t>
+      </w:r>
+      <w:r>
+        <w:t xml:space="preserve">placed by hand from one template: the same 32 cells at the same offsets inside</w:t>
+      </w:r>
+      <w:r>
+        <w:t xml:space="preserve"> </w:t>
+      </w:r>
+      <w:r>
+        <w:t xml:space="preserve">sixteen identical regions, fixed before the placer runs, with the routing left</w:t>
+      </w:r>
+      <w:r>
+        <w:t xml:space="preserve"> </w:t>
+      </w:r>
+      <w:r>
+        <w:t xml:space="preserve">to the flow. It asks how much of Arm A’s fingerprint is placement freedom on</w:t>
+      </w:r>
+      <w:r>
+        <w:t xml:space="preserve"> </w:t>
+      </w:r>
+      <w:r>
+        <w:t xml:space="preserve">its own. The selector in front of the counter grows from 32 inputs to 48, the</w:t>
+      </w:r>
+      <w:r>
+        <w:t xml:space="preserve"> </w:t>
+      </w:r>
+      <w:r>
+        <w:t xml:space="preserve">window becomes selectable, 256, 512, 2048 or 16384 reference-clock cycles, and</w:t>
+      </w:r>
+      <w:r>
+        <w:t xml:space="preserve"> </w:t>
+      </w:r>
+      <w:r>
+        <w:t xml:space="preserve">a counter wrap now latches a flag.</w:t>
+      </w:r>
+    </w:p>
+    <w:p>
+      <w:pPr>
+        <w:pStyle w:val="BodyText"/>
+      </w:pPr>
+      <w:r>
+        <w:t xml:space="preserve">In that build, run 83 of the project’s CI, the 512 cells of Arm A and the</w:t>
+      </w:r>
+      <w:r>
+        <w:t xml:space="preserve"> </w:t>
+      </w:r>
+      <w:r>
+        <w:t xml:space="preserve">sixteen Arm B macros sit at exactly the coordinates they have in the baseline.</w:t>
+      </w:r>
+      <w:r>
+        <w:t xml:space="preserve"> </w:t>
+      </w:r>
+      <w:r>
+        <w:t xml:space="preserve">Only the wiring was done again. It passes the same physical checks with zero</w:t>
+      </w:r>
+      <w:r>
+        <w:t xml:space="preserve"> </w:t>
+      </w:r>
+      <w:r>
+        <w:t xml:space="preserve">violations. Figure 1b shows it and Section 7.4 scores it.</w:t>
+      </w:r>
+    </w:p>
+    <w:p>
+      <w:pPr>
+        <w:pStyle w:val="CaptionedFigure"/>
+      </w:pPr>
+      <w:r>
+        <w:drawing>
+          <wp:inline>
+            <wp:extent cx="5334000" cy="3103418"/>
+            <wp:effectExtent b="0" l="0" r="0" t="0"/>
+            <wp:docPr descr="Figure 1b. Block diagram of the three-arm release build. Arm C’s sixteen rings are placed by hand from one template and routed by the flow; the core selects one of 48 and counts over a selectable window." title="" id="27" name="Picture"/>
+            <a:graphic>
+              <a:graphicData uri="http://schemas.openxmlformats.org/drawingml/2006/picture">
+                <pic:pic>
+                  <pic:nvPicPr>
+                    <pic:cNvPr descr="figures/chip_block_3arm.png" id="28" name="Picture"/>
+                    <pic:cNvPicPr>
+                      <a:picLocks noChangeArrowheads="1" noChangeAspect="1"/>
+                    </pic:cNvPicPr>
+                  </pic:nvPicPr>
+                  <pic:blipFill>
+                    <a:blip r:embed="rId26"/>
+                    <a:stretch>
+                      <a:fillRect/>
+                    </a:stretch>
+                  </pic:blipFill>
+                  <pic:spPr bwMode="auto">
+                    <a:xfrm>
+                      <a:off x="0" y="0"/>
+                      <a:ext cx="5334000" cy="3103418"/>
+                    </a:xfrm>
+                    <a:prstGeom prst="rect">
+                      <a:avLst/>
+                    </a:prstGeom>
+                    <a:noFill/>
+                    <a:ln w="9525">
+                      <a:noFill/>
+                      <a:headEnd/>
+                      <a:tailEnd/>
+                    </a:ln>
+                  </pic:spPr>
+                </pic:pic>
+              </a:graphicData>
+            </a:graphic>
+          </wp:inline>
+        </w:drawing>
+      </w:r>
+    </w:p>
+    <w:p>
+      <w:pPr>
+        <w:pStyle w:val="ImageCaption"/>
+      </w:pPr>
+      <w:r>
+        <w:t xml:space="preserve">Figure 1b. Block diagram of the three-arm release build. Arm C’s sixteen rings are placed by hand from one template and routed by the flow; the core selects one of 48 and counts over a selectable window.</w:t>
+      </w:r>
+    </w:p>
+    <w:bookmarkEnd w:id="29"/>
+    <w:bookmarkStart w:id="30" w:name="method"/>
     <w:p>
       <w:pPr>
         <w:pStyle w:val="Heading2"/>
@@ -2072,8 +2327,8 @@
         <w:t xml:space="preserve">slope, are the physically interesting parts.</w:t>
       </w:r>
     </w:p>
-    <w:bookmarkEnd w:id="27"/>
-    <w:bookmarkStart w:id="41" w:name="X793e95696ecc4333e91175ac45677fe7bdd1206"/>
+    <w:bookmarkEnd w:id="30"/>
+    <w:bookmarkStart w:id="44" w:name="X793e95696ecc4333e91175ac45677fe7bdd1206"/>
     <w:p>
       <w:pPr>
         <w:pStyle w:val="Heading2"/>
@@ -2082,7 +2337,7 @@
         <w:t xml:space="preserve">5. The layout term in automatically placed arrays</w:t>
       </w:r>
     </w:p>
-    <w:bookmarkStart w:id="31" w:name="earlier-32-oscillator-layout"/>
+    <w:bookmarkStart w:id="34" w:name="earlier-32-oscillator-layout"/>
     <w:p>
       <w:pPr>
         <w:pStyle w:val="Heading3"/>
@@ -2202,18 +2457,18 @@
           <wp:inline>
             <wp:extent cx="5334000" cy="2264727"/>
             <wp:effectExtent b="0" l="0" r="0" t="0"/>
-            <wp:docPr descr="Figure 2. Nominal post-layout results for the earlier 32-oscillator layout: frequency versus extracted ring capacitance with the no-parasitic control, and a spatial frequency map." title="" id="29" name="Picture"/>
+            <wp:docPr descr="Figure 2. Nominal post-layout results for the earlier 32-oscillator layout: frequency versus extracted ring capacitance with the no-parasitic control, and a spatial frequency map." title="" id="32" name="Picture"/>
             <a:graphic>
               <a:graphicData uri="http://schemas.openxmlformats.org/drawingml/2006/picture">
                 <pic:pic>
                   <pic:nvPicPr>
-                    <pic:cNvPr descr="../sim/spice/gono/ro_gono.png" id="30" name="Picture"/>
+                    <pic:cNvPr descr="../sim/spice/gono/ro_gono.png" id="33" name="Picture"/>
                     <pic:cNvPicPr>
                       <a:picLocks noChangeArrowheads="1" noChangeAspect="1"/>
                     </pic:cNvPicPr>
                   </pic:nvPicPr>
                   <pic:blipFill>
-                    <a:blip r:embed="rId28"/>
+                    <a:blip r:embed="rId31"/>
                     <a:stretch>
                       <a:fillRect/>
                     </a:stretch>
@@ -2248,8 +2503,8 @@
         <w:t xml:space="preserve">Figure 2. Nominal post-layout results for the earlier 32-oscillator layout: frequency versus extracted ring capacitance with the no-parasitic control, and a spatial frequency map.</w:t>
       </w:r>
     </w:p>
-    <w:bookmarkEnd w:id="31"/>
-    <w:bookmarkStart w:id="32" w:name="coherent-dual-arm-build"/>
+    <w:bookmarkEnd w:id="34"/>
+    <w:bookmarkStart w:id="35" w:name="coherent-dual-arm-build"/>
     <w:p>
       <w:pPr>
         <w:pStyle w:val="Heading3"/>
@@ -2263,7 +2518,7 @@
         <w:pStyle w:val="FirstParagraph"/>
       </w:pPr>
       <w:r>
-        <w:t xml:space="preserve">Arm A of the candidate build contains 16 automatically placed oscillators.</w:t>
+        <w:t xml:space="preserve">Arm A of the baseline build contains 16 automatically placed oscillators.</w:t>
       </w:r>
       <w:r>
         <w:t xml:space="preserve"> </w:t>
@@ -2337,7 +2592,7 @@
         <w:t xml:space="preserve"> </w:t>
       </w:r>
       <w:r>
-        <w:t xml:space="preserve">inserted into a loop, so the dispersion estimate and the candidate GDS come</w:t>
+        <w:t xml:space="preserve">inserted into a loop, so the dispersion estimate and the baseline GDS come</w:t>
       </w:r>
       <w:r>
         <w:t xml:space="preserve"> </w:t>
@@ -2427,7 +2682,7 @@
         <w:t xml:space="preserve"> </w:t>
       </w:r>
       <w:r>
-        <w:t xml:space="preserve">0.1% mean absolute error with rank correlation near 0.997, and the candidate</w:t>
+        <w:t xml:space="preserve">0.1% mean absolute error with rank correlation near 0.997, and the baseline</w:t>
       </w:r>
       <w:r>
         <w:t xml:space="preserve"> </w:t>
@@ -2456,8 +2711,8 @@
         <w:t xml:space="preserve">loads into frequencies is the same one every time.</w:t>
       </w:r>
     </w:p>
-    <w:bookmarkEnd w:id="32"/>
-    <w:bookmarkStart w:id="36" w:name="dispersion-across-nine-builds"/>
+    <w:bookmarkEnd w:id="35"/>
+    <w:bookmarkStart w:id="39" w:name="dispersion-across-nine-builds"/>
     <w:p>
       <w:pPr>
         <w:pStyle w:val="Heading3"/>
@@ -2529,7 +2784,7 @@
         <w:t xml:space="preserve"> </w:t>
       </w:r>
       <w:r>
-        <w:t xml:space="preserve">6.99%, and a standard deviation of 0.80% (Figure 3). The candidate build sits</w:t>
+        <w:t xml:space="preserve">6.99%, and a standard deviation of 0.80% (Figure 3). The baseline build sits</w:t>
       </w:r>
       <w:r>
         <w:t xml:space="preserve"> </w:t>
@@ -2594,7 +2849,7 @@
         <w:t xml:space="preserve"> </w:t>
       </w:r>
       <w:r>
-        <w:t xml:space="preserve">shipped configuration exactly and returned 5.53%, matching the candidate build</w:t>
+        <w:t xml:space="preserve">baseline configuration exactly and returned 5.53%, matching the baseline build</w:t>
       </w:r>
       <w:r>
         <w:t xml:space="preserve"> </w:t>
@@ -2636,18 +2891,18 @@
           <wp:inline>
             <wp:extent cx="5334000" cy="3333750"/>
             <wp:effectExtent b="0" l="0" r="0" t="0"/>
-            <wp:docPr descr="Figure 3. Nominal Arm A dispersion for nine builds that differ only in target placement density. The dashed line is the median, and the highlighted point is the shipped configuration." title="" id="34" name="Picture"/>
+            <wp:docPr descr="Figure 3. Nominal Arm A dispersion for nine builds that differ only in target placement density. The dashed line is the median, and the highlighted point is the baseline configuration." title="" id="37" name="Picture"/>
             <a:graphic>
               <a:graphicData uri="http://schemas.openxmlformats.org/drawingml/2006/picture">
                 <pic:pic>
                   <pic:nvPicPr>
-                    <pic:cNvPr descr="../dualarm/placement_sweep/placement_sweep.png" id="35" name="Picture"/>
+                    <pic:cNvPr descr="../dualarm/placement_sweep/placement_sweep.png" id="38" name="Picture"/>
                     <pic:cNvPicPr>
                       <a:picLocks noChangeArrowheads="1" noChangeAspect="1"/>
                     </pic:cNvPicPr>
                   </pic:nvPicPr>
                   <pic:blipFill>
-                    <a:blip r:embed="rId33"/>
+                    <a:blip r:embed="rId36"/>
                     <a:stretch>
                       <a:fillRect/>
                     </a:stretch>
@@ -2679,11 +2934,11 @@
         <w:pStyle w:val="ImageCaption"/>
       </w:pPr>
       <w:r>
-        <w:t xml:space="preserve">Figure 3. Nominal Arm A dispersion for nine builds that differ only in target placement density. The dashed line is the median, and the highlighted point is the shipped configuration.</w:t>
-      </w:r>
-    </w:p>
-    <w:bookmarkEnd w:id="36"/>
-    <w:bookmarkStart w:id="37" w:name="Xb8497a7e39c66adc61a0bf640a551b759a5cf57"/>
+        <w:t xml:space="preserve">Figure 3. Nominal Arm A dispersion for nine builds that differ only in target placement density. The dashed line is the median, and the highlighted point is the baseline configuration.</w:t>
+      </w:r>
+    </w:p>
+    <w:bookmarkEnd w:id="39"/>
+    <w:bookmarkStart w:id="40" w:name="Xb8497a7e39c66adc61a0bf640a551b759a5cf57"/>
     <w:p>
       <w:pPr>
         <w:pStyle w:val="Heading3"/>
@@ -2857,35 +3112,73 @@
         <w:t xml:space="preserve"> </w:t>
       </w:r>
       <w:r>
-        <w:t xml:space="preserve">oscillator frequency times the window duration, so at the fast corner the 16-bit</w:t>
-      </w:r>
-      <w:r>
-        <w:t xml:space="preserve"> </w:t>
-      </w:r>
-      <w:r>
-        <w:t xml:space="preserve">counter reaches 35532 of 65535, leaving 1.84x headroom at the 25 MHz reference</w:t>
-      </w:r>
-      <w:r>
-        <w:t xml:space="preserve"> </w:t>
-      </w:r>
-      <w:r>
-        <w:t xml:space="preserve">clock and the 1000-cycle window in the design. Dropping the reference clock below</w:t>
-      </w:r>
-      <w:r>
-        <w:t xml:space="preserve"> </w:t>
-      </w:r>
-      <w:r>
-        <w:t xml:space="preserve">13.55 MHz, or extending the window past 1844 cycles, would push the fast corner</w:t>
-      </w:r>
-      <w:r>
-        <w:t xml:space="preserve"> </w:t>
-      </w:r>
-      <w:r>
-        <w:t xml:space="preserve">into a silent wrap that returns a believable smaller count instead of an error.</w:t>
-      </w:r>
-    </w:p>
-    <w:bookmarkEnd w:id="37"/>
-    <w:bookmarkStart w:id="38" w:name="X0efac1f1e255c19817051e2d1a5e3950fe8fd7b"/>
+        <w:t xml:space="preserve">oscillator frequency times the window duration, so at the fast corner the</w:t>
+      </w:r>
+      <w:r>
+        <w:t xml:space="preserve"> </w:t>
+      </w:r>
+      <w:r>
+        <w:t xml:space="preserve">baseline’s 16-bit counter reaches 35532 of 65535, leaving 1.84x headroom at the</w:t>
+      </w:r>
+      <w:r>
+        <w:t xml:space="preserve"> </w:t>
+      </w:r>
+      <w:r>
+        <w:t xml:space="preserve">25 MHz reference clock and the fixed 1000-cycle window that design had.</w:t>
+      </w:r>
+      <w:r>
+        <w:t xml:space="preserve"> </w:t>
+      </w:r>
+      <w:r>
+        <w:t xml:space="preserve">Dropping the reference clock below 13.55 MHz, or extending the window past 1844</w:t>
+      </w:r>
+      <w:r>
+        <w:t xml:space="preserve"> </w:t>
+      </w:r>
+      <w:r>
+        <w:t xml:space="preserve">cycles, would have pushed the fast corner into a silent wrap that returns a</w:t>
+      </w:r>
+      <w:r>
+        <w:t xml:space="preserve"> </w:t>
+      </w:r>
+      <w:r>
+        <w:t xml:space="preserve">believable smaller count instead of an error.</w:t>
+      </w:r>
+    </w:p>
+    <w:p>
+      <w:pPr>
+        <w:pStyle w:val="BodyText"/>
+      </w:pPr>
+      <w:r>
+        <w:t xml:space="preserve">The release build changes both halves of that. Its window is selectable and a</w:t>
+      </w:r>
+      <w:r>
+        <w:t xml:space="preserve"> </w:t>
+      </w:r>
+      <w:r>
+        <w:t xml:space="preserve">wrap latches a flag rather than passing as a reading. At the 2048 cycles and 50</w:t>
+      </w:r>
+      <w:r>
+        <w:t xml:space="preserve"> </w:t>
+      </w:r>
+      <w:r>
+        <w:t xml:space="preserve">MHz the measurement firmware uses, the fastest ring on the release build, an</w:t>
+      </w:r>
+      <w:r>
+        <w:t xml:space="preserve"> </w:t>
+      </w:r>
+      <w:r>
+        <w:t xml:space="preserve">Arm C ring at 911.1 MHz at the fast corner, reads 37318, 1.76x under the</w:t>
+      </w:r>
+      <w:r>
+        <w:t xml:space="preserve"> </w:t>
+      </w:r>
+      <w:r>
+        <w:t xml:space="preserve">ceiling, and the clock would have to fall below 28.5 MHz before it wrapped.</w:t>
+      </w:r>
+    </w:p>
+    <w:bookmarkEnd w:id="40"/>
+    <w:bookmarkStart w:id="41" w:name="X0efac1f1e255c19817051e2d1a5e3950fe8fd7b"/>
     <w:p>
       <w:pPr>
         <w:pStyle w:val="Heading3"/>
@@ -3285,8 +3578,8 @@
         <w:t xml:space="preserve">grounded for want of a partner.</w:t>
       </w:r>
     </w:p>
-    <w:bookmarkEnd w:id="38"/>
-    <w:bookmarkStart w:id="39" w:name="Xe5e0114fc0f12af71401cf9ce637497ba9985a9"/>
+    <w:bookmarkEnd w:id="41"/>
+    <w:bookmarkStart w:id="42" w:name="Xe5e0114fc0f12af71401cf9ce637497ba9985a9"/>
     <w:p>
       <w:pPr>
         <w:pStyle w:val="Heading3"/>
@@ -3475,8 +3768,8 @@
         <w:t xml:space="preserve">be used for.</w:t>
       </w:r>
     </w:p>
-    <w:bookmarkEnd w:id="39"/>
-    <w:bookmarkStart w:id="40" w:name="what-a-single-reading-can-resolve"/>
+    <w:bookmarkEnd w:id="42"/>
+    <w:bookmarkStart w:id="43" w:name="what-a-single-reading-can-resolve"/>
     <w:p>
       <w:pPr>
         <w:pStyle w:val="Heading3"/>
@@ -3537,7 +3830,7 @@
         <w:pStyle w:val="BodyText"/>
       </w:pPr>
       <w:r>
-        <w:t xml:space="preserve">They read the shipped netlist and SPEF used everywhere else in this work and</w:t>
+        <w:t xml:space="preserve">They read the baseline netlist and SPEF used everywhere else in this work and</w:t>
       </w:r>
       <w:r>
         <w:t xml:space="preserve"> </w:t>
@@ -3945,7 +4238,19 @@
         <w:t xml:space="preserve"> </w:t>
       </w:r>
       <w:r>
-        <w:t xml:space="preserve">oscillator sets the floor.</w:t>
+        <w:t xml:space="preserve">oscillator sets the floor. The release build counts over 2048 cycles at 50 MHz,</w:t>
+      </w:r>
+      <w:r>
+        <w:t xml:space="preserve"> </w:t>
+      </w:r>
+      <w:r>
+        <w:t xml:space="preserve">41 microseconds rather than 40, which moves these figures by about two percent</w:t>
+      </w:r>
+      <w:r>
+        <w:t xml:space="preserve"> </w:t>
+      </w:r>
+      <w:r>
+        <w:t xml:space="preserve">and none of the conclusions.</w:t>
       </w:r>
     </w:p>
     <w:p>
@@ -3968,9 +4273,9 @@
         <w:t xml:space="preserve">separation and 141 times below the compensation residual.</w:t>
       </w:r>
     </w:p>
-    <w:bookmarkEnd w:id="40"/>
-    <w:bookmarkEnd w:id="41"/>
-    <w:bookmarkStart w:id="44" w:name="can-the-layout-term-be-predicted"/>
+    <w:bookmarkEnd w:id="43"/>
+    <w:bookmarkEnd w:id="44"/>
+    <w:bookmarkStart w:id="47" w:name="can-the-layout-term-be-predicted"/>
     <w:p>
       <w:pPr>
         <w:pStyle w:val="Heading2"/>
@@ -4005,7 +4310,7 @@
         <w:t xml:space="preserve">they can. Section 7 turns the answer into bits.</w:t>
       </w:r>
     </w:p>
-    <w:bookmarkStart w:id="42" w:name="fitting-on-the-victim"/>
+    <w:bookmarkStart w:id="45" w:name="fitting-on-the-victim"/>
     <w:p>
       <w:pPr>
         <w:pStyle w:val="Heading3"/>
@@ -4147,7 +4452,7 @@
         <w:t xml:space="preserve"> </w:t>
       </w:r>
       <w:r>
-        <w:t xml:space="preserve">shipped build’s full RC frequencies, whose uncorrected spread is 1.739%</w:t>
+        <w:t xml:space="preserve">baseline build’s full RC frequencies, whose uncorrected spread is 1.739%</w:t>
       </w:r>
       <w:r>
         <w:t xml:space="preserve"> </w:t>
@@ -4371,7 +4676,7 @@
         <w:t xml:space="preserve"> </w:t>
       </w:r>
       <w:r>
-        <w:t xml:space="preserve">trained on the 32-oscillator layout reproduces the shipped build’s</w:t>
+        <w:t xml:space="preserve">trained on the 32-oscillator layout reproduces the baseline build’s</w:t>
       </w:r>
       <w:r>
         <w:t xml:space="preserve"> </w:t>
@@ -4478,8 +4783,8 @@
         <w:t xml:space="preserve">checked-in tables.</w:t>
       </w:r>
     </w:p>
-    <w:bookmarkEnd w:id="42"/>
-    <w:bookmarkStart w:id="43" w:name="fitting-on-somebody-elses-build"/>
+    <w:bookmarkEnd w:id="45"/>
+    <w:bookmarkStart w:id="46" w:name="fitting-on-somebody-elses-build"/>
     <w:p>
       <w:pPr>
         <w:pStyle w:val="Heading3"/>
@@ -4572,7 +4877,7 @@
         <w:t xml:space="preserve"> </w:t>
       </w:r>
       <w:r>
-        <w:t xml:space="preserve">the shipped build.</w:t>
+        <w:t xml:space="preserve">the baseline build.</w:t>
       </w:r>
     </w:p>
     <w:p>
@@ -4586,7 +4891,7 @@
         <w:t xml:space="preserve"> </w:t>
       </w:r>
       <w:r>
-        <w:t xml:space="preserve">earlier build, never refitted, applied to the shipped build’s full RC</w:t>
+        <w:t xml:space="preserve">earlier build, never refitted, applied to the baseline build’s full RC</w:t>
       </w:r>
       <w:r>
         <w:t xml:space="preserve"> </w:t>
@@ -4782,7 +5087,7 @@
               <w:jc w:val="left"/>
             </w:pPr>
             <w:r>
-              <w:t xml:space="preserve">shipped build, lumped decks</w:t>
+              <w:t xml:space="preserve">baseline build, lumped decks</w:t>
             </w:r>
           </w:p>
         </w:tc>
@@ -4832,7 +5137,7 @@
               <w:jc w:val="left"/>
             </w:pPr>
             <w:r>
-              <w:t xml:space="preserve">shipped build, leave-one-out</w:t>
+              <w:t xml:space="preserve">baseline build, leave-one-out</w:t>
             </w:r>
           </w:p>
         </w:tc>
@@ -4873,7 +5178,7 @@
         <w:t xml:space="preserve"> </w:t>
       </w:r>
       <w:r>
-        <w:t xml:space="preserve">model fitted on the shipped build and applied to the earlier one’s 32 rings,</w:t>
+        <w:t xml:space="preserve">model fitted on the baseline build and applied to the earlier one’s 32 rings,</w:t>
       </w:r>
       <w:r>
         <w:t xml:space="preserve"> </w:t>
@@ -4913,7 +5218,7 @@
         <w:t xml:space="preserve"> </w:t>
       </w:r>
       <w:r>
-        <w:t xml:space="preserve">+0.0035 on the shipped one, opposite in sign, so the extra accuracy it buys</w:t>
+        <w:t xml:space="preserve">+0.0035 on the baseline one, opposite in sign, so the extra accuracy it buys</w:t>
       </w:r>
       <w:r>
         <w:t xml:space="preserve"> </w:t>
@@ -4951,7 +5256,7 @@
         <w:t xml:space="preserve"> </w:t>
       </w:r>
       <w:r>
-        <w:t xml:space="preserve">shipped build the way the full simulation does.</w:t>
+        <w:t xml:space="preserve">baseline build the way the full simulation does.</w:t>
       </w:r>
     </w:p>
     <w:p>
@@ -5072,9 +5377,9 @@
         <w:t xml:space="preserve">.</w:t>
       </w:r>
     </w:p>
-    <w:bookmarkEnd w:id="43"/>
-    <w:bookmarkEnd w:id="44"/>
-    <w:bookmarkStart w:id="54" w:name="X54baadc05f82e88550dfa21181b0dc243d0d400"/>
+    <w:bookmarkEnd w:id="46"/>
+    <w:bookmarkEnd w:id="47"/>
+    <w:bookmarkStart w:id="58" w:name="X54baadc05f82e88550dfa21181b0dc243d0d400"/>
     <w:p>
       <w:pPr>
         <w:pStyle w:val="Heading2"/>
@@ -5083,7 +5388,7 @@
         <w:t xml:space="preserve">7. How many response bits the design files decide</w:t>
       </w:r>
     </w:p>
-    <w:bookmarkStart w:id="48" w:name="counting-the-bits"/>
+    <w:bookmarkStart w:id="51" w:name="counting-the-bits"/>
     <w:p>
       <w:pPr>
         <w:pStyle w:val="Heading3"/>
@@ -5487,18 +5792,18 @@
           <wp:inline>
             <wp:extent cx="5334000" cy="2319130"/>
             <wp:effectExtent b="0" l="0" r="0" t="0"/>
-            <wp:docPr descr="Figure 4. Arm A’s eight adjacent-pair bits. On the left, each pair’s routing-induced separation in standard deviations of the estimated mismatch term; the shaded strip is where mismatch can still decide the sign. On the right, the across-die entropy left in each bit, against the full bit per pair Arm B keeps; Section 8.2 measures that at 7.9997 of 8." title="" id="46" name="Picture"/>
+            <wp:docPr descr="Figure 4. Arm A’s eight adjacent-pair bits. On the left, each pair’s routing-induced separation in standard deviations of the estimated mismatch term; the shaded strip is where mismatch can still decide the sign. On the right, the across-die entropy left in each bit, against the full bit per pair Arm B keeps; Section 8.2 measures that at 7.9997 of 8." title="" id="49" name="Picture"/>
             <a:graphic>
               <a:graphicData uri="http://schemas.openxmlformats.org/drawingml/2006/picture">
                 <pic:pic>
                   <pic:nvPicPr>
-                    <pic:cNvPr descr="../sim/spice/gono/predictable_bits.png" id="47" name="Picture"/>
+                    <pic:cNvPr descr="../sim/spice/gono/predictable_bits.png" id="50" name="Picture"/>
                     <pic:cNvPicPr>
                       <a:picLocks noChangeArrowheads="1" noChangeAspect="1"/>
                     </pic:cNvPicPr>
                   </pic:nvPicPr>
                   <pic:blipFill>
-                    <a:blip r:embed="rId45"/>
+                    <a:blip r:embed="rId48"/>
                     <a:stretch>
                       <a:fillRect/>
                     </a:stretch>
@@ -5574,8 +5879,8 @@
         <w:t xml:space="preserve">drift apart.</w:t>
       </w:r>
     </w:p>
-    <w:bookmarkEnd w:id="48"/>
-    <w:bookmarkStart w:id="52" w:name="if-the-layout-term-is-compensated-away"/>
+    <w:bookmarkEnd w:id="51"/>
+    <w:bookmarkStart w:id="55" w:name="if-the-layout-term-is-compensated-away"/>
     <w:p>
       <w:pPr>
         <w:pStyle w:val="Heading3"/>
@@ -5639,7 +5944,7 @@
         <w:t xml:space="preserve"> </w:t>
       </w:r>
       <w:r>
-        <w:t xml:space="preserve">same 0.062% mismatch scale is applied. Nothing about the shipped design does</w:t>
+        <w:t xml:space="preserve">same 0.062% mismatch scale is applied. Nothing in the design does</w:t>
       </w:r>
       <w:r>
         <w:t xml:space="preserve"> </w:t>
@@ -5913,18 +6218,18 @@
           <wp:inline>
             <wp:extent cx="5334000" cy="2319130"/>
             <wp:effectExtent b="0" l="0" r="0" t="0"/>
-            <wp:docPr descr="Figure 5. What compensating the layout term does to Arm A’s eight bits. On the left, the across-die entropy of each bit before and after each ring has its predicted layout term removed; the green line is a full bit. On the right, the probability that a reader holding only the public design files calls the bit correctly, against 50% for guessing. The correction is computed from the published extraction, so it is available to the reader as well as to the designer." title="" id="50" name="Picture"/>
+            <wp:docPr descr="Figure 5. What compensating the layout term does to Arm A’s eight bits. On the left, the across-die entropy of each bit before and after each ring has its predicted layout term removed; the green line is a full bit. On the right, the probability that a reader holding only the public design files calls the bit correctly, against 50% for guessing. The correction is computed from the published extraction, so it is available to the reader as well as to the designer." title="" id="53" name="Picture"/>
             <a:graphic>
               <a:graphicData uri="http://schemas.openxmlformats.org/drawingml/2006/picture">
                 <pic:pic>
                   <pic:nvPicPr>
-                    <pic:cNvPr descr="../sim/spice/gono/compensated_bits.png" id="51" name="Picture"/>
+                    <pic:cNvPr descr="../sim/spice/gono/compensated_bits.png" id="54" name="Picture"/>
                     <pic:cNvPicPr>
                       <a:picLocks noChangeArrowheads="1" noChangeAspect="1"/>
                     </pic:cNvPicPr>
                   </pic:nvPicPr>
                   <pic:blipFill>
-                    <a:blip r:embed="rId49"/>
+                    <a:blip r:embed="rId52"/>
                     <a:stretch>
                       <a:fillRect/>
                     </a:stretch>
@@ -6057,8 +6362,8 @@
         <w:t xml:space="preserve">raw SPEF with its own solver.</w:t>
       </w:r>
     </w:p>
-    <w:bookmarkEnd w:id="52"/>
-    <w:bookmarkStart w:id="53" w:name="Xe95d5ba626d83ee72acae1569c92991337cfee1"/>
+    <w:bookmarkEnd w:id="55"/>
+    <w:bookmarkStart w:id="56" w:name="Xe95d5ba626d83ee72acae1569c92991337cfee1"/>
     <w:p>
       <w:pPr>
         <w:pStyle w:val="Heading3"/>
@@ -6909,7 +7214,7 @@
         <w:t xml:space="preserve"> </w:t>
       </w:r>
       <w:r>
-        <w:t xml:space="preserve">shipped build. The two builds have nearly the same spread, 1.90% and 1.74%, so</w:t>
+        <w:t xml:space="preserve">baseline build. The two builds have nearly the same spread, 1.90% and 1.74%, so</w:t>
       </w:r>
       <w:r>
         <w:t xml:space="preserve"> </w:t>
@@ -6947,7 +7252,7 @@
         <w:t xml:space="preserve"> </w:t>
       </w:r>
       <w:r>
-        <w:t xml:space="preserve">cost cannot be scored, and the shipped build says reliability is exactly where</w:t>
+        <w:t xml:space="preserve">cost cannot be scored, and the baseline build says reliability is exactly where</w:t>
       </w:r>
       <w:r>
         <w:t xml:space="preserve"> </w:t>
@@ -7055,9 +7360,805 @@
         <w:t xml:space="preserve">of rings, which never enumerates a pairing at all.</w:t>
       </w:r>
     </w:p>
-    <w:bookmarkEnd w:id="53"/>
-    <w:bookmarkEnd w:id="54"/>
-    <w:bookmarkStart w:id="63" w:name="matched-macro-arm"/>
+    <w:bookmarkEnd w:id="56"/>
+    <w:bookmarkStart w:id="57" w:name="the-build-that-is-actually-being-made"/>
+    <w:p>
+      <w:pPr>
+        <w:pStyle w:val="Heading3"/>
+      </w:pPr>
+      <w:r>
+        <w:t xml:space="preserve">7.4 The build that is actually being made</w:t>
+      </w:r>
+    </w:p>
+    <w:p>
+      <w:pPr>
+        <w:pStyle w:val="FirstParagraph"/>
+      </w:pPr>
+      <w:r>
+        <w:t xml:space="preserve">Everything above was scored on the baseline. The chip going to the shuttle is</w:t>
+      </w:r>
+      <w:r>
+        <w:t xml:space="preserve"> </w:t>
+      </w:r>
+      <w:r>
+        <w:t xml:space="preserve">the three-arm release build of Section 3, and its Arm A cells sit at the</w:t>
+      </w:r>
+      <w:r>
+        <w:t xml:space="preserve"> </w:t>
+      </w:r>
+      <w:r>
+        <w:t xml:space="preserve">baseline’s coordinates to the database unit, so I expected the same eight bits</w:t>
+      </w:r>
+      <w:r>
+        <w:t xml:space="preserve"> </w:t>
+      </w:r>
+      <w:r>
+        <w:t xml:space="preserve">back. They did not all come back.</w:t>
+      </w:r>
+    </w:p>
+    <w:p>
+      <w:pPr>
+        <w:pStyle w:val="BodyText"/>
+      </w:pPr>
+      <w:r>
+        <w:t xml:space="preserve">Scored the same way from the release build’s own extraction, with the full RC</w:t>
+      </w:r>
+      <w:r>
+        <w:t xml:space="preserve"> </w:t>
+      </w:r>
+      <w:r>
+        <w:t xml:space="preserve">network and the same 0.062% per ring:</w:t>
+      </w:r>
+    </w:p>
+    <w:tbl>
+      <w:tblPr>
+        <w:tblStyle w:val="Table"/>
+        <w:tblW w:type="auto" w:w="0"/>
+        <w:tblLook w:firstRow="1" w:lastRow="0" w:firstColumn="0" w:lastColumn="0" w:noHBand="0" w:noVBand="0" w:val="0020"/>
+        <w:jc w:val="start"/>
+      </w:tblPr>
+      <w:tblGrid>
+        <w:gridCol w:w="1980"/>
+        <w:gridCol w:w="1980"/>
+        <w:gridCol w:w="1980"/>
+        <w:gridCol w:w="1980"/>
+      </w:tblGrid>
+      <w:tr>
+        <w:trPr>
+          <w:tblHeader w:val="true"/>
+        </w:trPr>
+        <w:tc>
+          <w:tcPr/>
+          <w:p>
+            <w:pPr>
+              <w:pStyle w:val="Compact"/>
+              <w:jc w:val="left"/>
+            </w:pPr>
+            <w:r>
+              <w:t xml:space="preserve">pair</w:t>
+            </w:r>
+          </w:p>
+        </w:tc>
+        <w:tc>
+          <w:tcPr/>
+          <w:p>
+            <w:pPr>
+              <w:pStyle w:val="Compact"/>
+              <w:jc w:val="right"/>
+            </w:pPr>
+            <w:r>
+              <w:t xml:space="preserve">separation</w:t>
+            </w:r>
+          </w:p>
+        </w:tc>
+        <w:tc>
+          <w:tcPr/>
+          <w:p>
+            <w:pPr>
+              <w:pStyle w:val="Compact"/>
+              <w:jc w:val="right"/>
+            </w:pPr>
+            <w:r>
+              <w:t xml:space="preserve">standard deviations</w:t>
+            </w:r>
+          </w:p>
+        </w:tc>
+        <w:tc>
+          <w:tcPr/>
+          <w:p>
+            <w:pPr>
+              <w:pStyle w:val="Compact"/>
+              <w:jc w:val="right"/>
+            </w:pPr>
+            <w:r>
+              <w:t xml:space="preserve">entropy</w:t>
+            </w:r>
+          </w:p>
+        </w:tc>
+      </w:tr>
+      <w:tr>
+        <w:tc>
+          <w:tcPr/>
+          <w:p>
+            <w:pPr>
+              <w:pStyle w:val="Compact"/>
+              <w:jc w:val="left"/>
+            </w:pPr>
+            <w:r>
+              <w:t xml:space="preserve">0/1</w:t>
+            </w:r>
+          </w:p>
+        </w:tc>
+        <w:tc>
+          <w:tcPr/>
+          <w:p>
+            <w:pPr>
+              <w:pStyle w:val="Compact"/>
+              <w:jc w:val="right"/>
+            </w:pPr>
+            <w:r>
+              <w:t xml:space="preserve">+1.083%</w:t>
+            </w:r>
+          </w:p>
+        </w:tc>
+        <w:tc>
+          <w:tcPr/>
+          <w:p>
+            <w:pPr>
+              <w:pStyle w:val="Compact"/>
+              <w:jc w:val="right"/>
+            </w:pPr>
+            <w:r>
+              <w:t xml:space="preserve">12.3</w:t>
+            </w:r>
+          </w:p>
+        </w:tc>
+        <w:tc>
+          <w:tcPr/>
+          <w:p>
+            <w:pPr>
+              <w:pStyle w:val="Compact"/>
+              <w:jc w:val="right"/>
+            </w:pPr>
+            <w:r>
+              <w:t xml:space="preserve">0.000</w:t>
+            </w:r>
+          </w:p>
+        </w:tc>
+      </w:tr>
+      <w:tr>
+        <w:tc>
+          <w:tcPr/>
+          <w:p>
+            <w:pPr>
+              <w:pStyle w:val="Compact"/>
+              <w:jc w:val="left"/>
+            </w:pPr>
+            <w:r>
+              <w:t xml:space="preserve">2/3</w:t>
+            </w:r>
+          </w:p>
+        </w:tc>
+        <w:tc>
+          <w:tcPr/>
+          <w:p>
+            <w:pPr>
+              <w:pStyle w:val="Compact"/>
+              <w:jc w:val="right"/>
+            </w:pPr>
+            <w:r>
+              <w:t xml:space="preserve">+0.212%</w:t>
+            </w:r>
+          </w:p>
+        </w:tc>
+        <w:tc>
+          <w:tcPr/>
+          <w:p>
+            <w:pPr>
+              <w:pStyle w:val="Compact"/>
+              <w:jc w:val="right"/>
+            </w:pPr>
+            <w:r>
+              <w:t xml:space="preserve">2.4</w:t>
+            </w:r>
+          </w:p>
+        </w:tc>
+        <w:tc>
+          <w:tcPr/>
+          <w:p>
+            <w:pPr>
+              <w:pStyle w:val="Compact"/>
+              <w:jc w:val="right"/>
+            </w:pPr>
+            <w:r>
+              <w:t xml:space="preserve">0.066</w:t>
+            </w:r>
+          </w:p>
+        </w:tc>
+      </w:tr>
+      <w:tr>
+        <w:tc>
+          <w:tcPr/>
+          <w:p>
+            <w:pPr>
+              <w:pStyle w:val="Compact"/>
+              <w:jc w:val="left"/>
+            </w:pPr>
+            <w:r>
+              <w:t xml:space="preserve">4/5</w:t>
+            </w:r>
+          </w:p>
+        </w:tc>
+        <w:tc>
+          <w:tcPr/>
+          <w:p>
+            <w:pPr>
+              <w:pStyle w:val="Compact"/>
+              <w:jc w:val="right"/>
+            </w:pPr>
+            <w:r>
+              <w:t xml:space="preserve">+2.037%</w:t>
+            </w:r>
+          </w:p>
+        </w:tc>
+        <w:tc>
+          <w:tcPr/>
+          <w:p>
+            <w:pPr>
+              <w:pStyle w:val="Compact"/>
+              <w:jc w:val="right"/>
+            </w:pPr>
+            <w:r>
+              <w:t xml:space="preserve">23.2</w:t>
+            </w:r>
+          </w:p>
+        </w:tc>
+        <w:tc>
+          <w:tcPr/>
+          <w:p>
+            <w:pPr>
+              <w:pStyle w:val="Compact"/>
+              <w:jc w:val="right"/>
+            </w:pPr>
+            <w:r>
+              <w:t xml:space="preserve">0.000</w:t>
+            </w:r>
+          </w:p>
+        </w:tc>
+      </w:tr>
+      <w:tr>
+        <w:tc>
+          <w:tcPr/>
+          <w:p>
+            <w:pPr>
+              <w:pStyle w:val="Compact"/>
+              <w:jc w:val="left"/>
+            </w:pPr>
+            <w:r>
+              <w:t xml:space="preserve">6/7</w:t>
+            </w:r>
+          </w:p>
+        </w:tc>
+        <w:tc>
+          <w:tcPr/>
+          <w:p>
+            <w:pPr>
+              <w:pStyle w:val="Compact"/>
+              <w:jc w:val="right"/>
+            </w:pPr>
+            <w:r>
+              <w:t xml:space="preserve">-1.423%</w:t>
+            </w:r>
+          </w:p>
+        </w:tc>
+        <w:tc>
+          <w:tcPr/>
+          <w:p>
+            <w:pPr>
+              <w:pStyle w:val="Compact"/>
+              <w:jc w:val="right"/>
+            </w:pPr>
+            <w:r>
+              <w:t xml:space="preserve">16.2</w:t>
+            </w:r>
+          </w:p>
+        </w:tc>
+        <w:tc>
+          <w:tcPr/>
+          <w:p>
+            <w:pPr>
+              <w:pStyle w:val="Compact"/>
+              <w:jc w:val="right"/>
+            </w:pPr>
+            <w:r>
+              <w:t xml:space="preserve">0.000</w:t>
+            </w:r>
+          </w:p>
+        </w:tc>
+      </w:tr>
+      <w:tr>
+        <w:tc>
+          <w:tcPr/>
+          <w:p>
+            <w:pPr>
+              <w:pStyle w:val="Compact"/>
+              <w:jc w:val="left"/>
+            </w:pPr>
+            <w:r>
+              <w:t xml:space="preserve">8/9</w:t>
+            </w:r>
+          </w:p>
+        </w:tc>
+        <w:tc>
+          <w:tcPr/>
+          <w:p>
+            <w:pPr>
+              <w:pStyle w:val="Compact"/>
+              <w:jc w:val="right"/>
+            </w:pPr>
+            <w:r>
+              <w:t xml:space="preserve">-0.316%</w:t>
+            </w:r>
+          </w:p>
+        </w:tc>
+        <w:tc>
+          <w:tcPr/>
+          <w:p>
+            <w:pPr>
+              <w:pStyle w:val="Compact"/>
+              <w:jc w:val="right"/>
+            </w:pPr>
+            <w:r>
+              <w:t xml:space="preserve">3.6</w:t>
+            </w:r>
+          </w:p>
+        </w:tc>
+        <w:tc>
+          <w:tcPr/>
+          <w:p>
+            <w:pPr>
+              <w:pStyle w:val="Compact"/>
+              <w:jc w:val="right"/>
+            </w:pPr>
+            <w:r>
+              <w:t xml:space="preserve">0.002</w:t>
+            </w:r>
+          </w:p>
+        </w:tc>
+      </w:tr>
+      <w:tr>
+        <w:tc>
+          <w:tcPr/>
+          <w:p>
+            <w:pPr>
+              <w:pStyle w:val="Compact"/>
+              <w:jc w:val="left"/>
+            </w:pPr>
+            <w:r>
+              <w:t xml:space="preserve">10/11</w:t>
+            </w:r>
+          </w:p>
+        </w:tc>
+        <w:tc>
+          <w:tcPr/>
+          <w:p>
+            <w:pPr>
+              <w:pStyle w:val="Compact"/>
+              <w:jc w:val="right"/>
+            </w:pPr>
+            <w:r>
+              <w:t xml:space="preserve">-2.291%</w:t>
+            </w:r>
+          </w:p>
+        </w:tc>
+        <w:tc>
+          <w:tcPr/>
+          <w:p>
+            <w:pPr>
+              <w:pStyle w:val="Compact"/>
+              <w:jc w:val="right"/>
+            </w:pPr>
+            <w:r>
+              <w:t xml:space="preserve">26.1</w:t>
+            </w:r>
+          </w:p>
+        </w:tc>
+        <w:tc>
+          <w:tcPr/>
+          <w:p>
+            <w:pPr>
+              <w:pStyle w:val="Compact"/>
+              <w:jc w:val="right"/>
+            </w:pPr>
+            <w:r>
+              <w:t xml:space="preserve">0.000</w:t>
+            </w:r>
+          </w:p>
+        </w:tc>
+      </w:tr>
+      <w:tr>
+        <w:tc>
+          <w:tcPr/>
+          <w:p>
+            <w:pPr>
+              <w:pStyle w:val="Compact"/>
+              <w:jc w:val="left"/>
+            </w:pPr>
+            <w:r>
+              <w:t xml:space="preserve">12/13</w:t>
+            </w:r>
+          </w:p>
+        </w:tc>
+        <w:tc>
+          <w:tcPr/>
+          <w:p>
+            <w:pPr>
+              <w:pStyle w:val="Compact"/>
+              <w:jc w:val="right"/>
+            </w:pPr>
+            <w:r>
+              <w:t xml:space="preserve">-2.878%</w:t>
+            </w:r>
+          </w:p>
+        </w:tc>
+        <w:tc>
+          <w:tcPr/>
+          <w:p>
+            <w:pPr>
+              <w:pStyle w:val="Compact"/>
+              <w:jc w:val="right"/>
+            </w:pPr>
+            <w:r>
+              <w:t xml:space="preserve">32.8</w:t>
+            </w:r>
+          </w:p>
+        </w:tc>
+        <w:tc>
+          <w:tcPr/>
+          <w:p>
+            <w:pPr>
+              <w:pStyle w:val="Compact"/>
+              <w:jc w:val="right"/>
+            </w:pPr>
+            <w:r>
+              <w:t xml:space="preserve">0.000</w:t>
+            </w:r>
+          </w:p>
+        </w:tc>
+      </w:tr>
+      <w:tr>
+        <w:tc>
+          <w:tcPr/>
+          <w:p>
+            <w:pPr>
+              <w:pStyle w:val="Compact"/>
+              <w:jc w:val="left"/>
+            </w:pPr>
+            <w:r>
+              <w:t xml:space="preserve">14/15</w:t>
+            </w:r>
+          </w:p>
+        </w:tc>
+        <w:tc>
+          <w:tcPr/>
+          <w:p>
+            <w:pPr>
+              <w:pStyle w:val="Compact"/>
+              <w:jc w:val="right"/>
+            </w:pPr>
+            <w:r>
+              <w:t xml:space="preserve">-1.840%</w:t>
+            </w:r>
+          </w:p>
+        </w:tc>
+        <w:tc>
+          <w:tcPr/>
+          <w:p>
+            <w:pPr>
+              <w:pStyle w:val="Compact"/>
+              <w:jc w:val="right"/>
+            </w:pPr>
+            <w:r>
+              <w:t xml:space="preserve">21.0</w:t>
+            </w:r>
+          </w:p>
+        </w:tc>
+        <w:tc>
+          <w:tcPr/>
+          <w:p>
+            <w:pPr>
+              <w:pStyle w:val="Compact"/>
+              <w:jc w:val="right"/>
+            </w:pPr>
+            <w:r>
+              <w:t xml:space="preserve">0.000</w:t>
+            </w:r>
+          </w:p>
+        </w:tc>
+      </w:tr>
+    </w:tbl>
+    <w:p>
+      <w:pPr>
+        <w:pStyle w:val="BodyText"/>
+      </w:pPr>
+      <w:r>
+        <w:t xml:space="preserve">Seven of the eight carry under a hundredth of a bit. The arm holds 0.07 bits of</w:t>
+      </w:r>
+      <w:r>
+        <w:t xml:space="preserve"> </w:t>
+      </w:r>
+      <w:r>
+        <w:t xml:space="preserve">8 and a reader of the public files calls 7.99, where the baseline gave 0.46 and</w:t>
+      </w:r>
+      <w:r>
+        <w:t xml:space="preserve"> </w:t>
+      </w:r>
+      <w:r>
+        <w:t xml:space="preserve">7.91, and across the sampling interval of Section 5.6 that becomes 0.02 to 0.22</w:t>
+      </w:r>
+      <w:r>
+        <w:t xml:space="preserve"> </w:t>
+      </w:r>
+      <w:r>
+        <w:t xml:space="preserve">bits and 7.97 to 8.00. The full RC network is the model that matters on this</w:t>
+      </w:r>
+      <w:r>
+        <w:t xml:space="preserve"> </w:t>
+      </w:r>
+      <w:r>
+        <w:t xml:space="preserve">build. It closes pairs 2/3 and 8/9 from 0.73% and 1.08% under the lumped decks</w:t>
+      </w:r>
+      <w:r>
+        <w:t xml:space="preserve"> </w:t>
+      </w:r>
+      <w:r>
+        <w:t xml:space="preserve">to 0.212% and 0.316%, and under the lumped decks the arm would hold nothing at</w:t>
+      </w:r>
+      <w:r>
+        <w:t xml:space="preserve"> </w:t>
+      </w:r>
+      <w:r>
+        <w:t xml:space="preserve">all. Ranking the rings by extracted capacitance alone still gets all eight</w:t>
+      </w:r>
+      <w:r>
+        <w:t xml:space="preserve"> </w:t>
+      </w:r>
+      <w:r>
+        <w:t xml:space="preserve">signs.</w:t>
+      </w:r>
+    </w:p>
+    <w:p>
+      <w:pPr>
+        <w:pStyle w:val="BodyText"/>
+      </w:pPr>
+      <w:r>
+        <w:t xml:space="preserve">The bits themselves moved. The baseline reads</w:t>
+      </w:r>
+      <w:r>
+        <w:t xml:space="preserve"> </w:t>
+      </w:r>
+      <w:r>
+        <w:rPr>
+          <w:rStyle w:val="VerbatimChar"/>
+        </w:rPr>
+        <w:t xml:space="preserve">01101000</w:t>
+      </w:r>
+      <w:r>
+        <w:t xml:space="preserve"> </w:t>
+      </w:r>
+      <w:r>
+        <w:t xml:space="preserve">and the release build</w:t>
+      </w:r>
+      <w:r>
+        <w:t xml:space="preserve"> </w:t>
+      </w:r>
+      <w:r>
+        <w:rPr>
+          <w:rStyle w:val="VerbatimChar"/>
+        </w:rPr>
+        <w:t xml:space="preserve">11100000</w:t>
+      </w:r>
+      <w:r>
+        <w:t xml:space="preserve">: pairs 0 and 4 flip, the same way at ss, tt and ff and under both</w:t>
+      </w:r>
+      <w:r>
+        <w:t xml:space="preserve"> </w:t>
+      </w:r>
+      <w:r>
+        <w:t xml:space="preserve">parasitic models. Nothing changed between the builds but wire. The router took</w:t>
+      </w:r>
+      <w:r>
+        <w:t xml:space="preserve"> </w:t>
+      </w:r>
+      <w:r>
+        <w:t xml:space="preserve">different paths to the same cells, one ring’s loop capacitance moved by 3.4 fF,</w:t>
+      </w:r>
+      <w:r>
+        <w:t xml:space="preserve"> </w:t>
+      </w:r>
+      <w:r>
+        <w:t xml:space="preserve">and the rank correlation between the two builds’ sixteen loop capacitances is</w:t>
+      </w:r>
+      <w:r>
+        <w:t xml:space="preserve"> </w:t>
+      </w:r>
+      <w:r>
+        <w:t xml:space="preserve">0.71.</w:t>
+      </w:r>
+    </w:p>
+    <w:p>
+      <w:pPr>
+        <w:pStyle w:val="BodyText"/>
+      </w:pPr>
+      <w:r>
+        <w:t xml:space="preserve">That sharpens Section 6.2 rather than undoing it. The slope carries from one</w:t>
+      </w:r>
+      <w:r>
+        <w:t xml:space="preserve"> </w:t>
+      </w:r>
+      <w:r>
+        <w:t xml:space="preserve">build to another; the individual loads do not, because they are the router’s,</w:t>
+      </w:r>
+      <w:r>
+        <w:t xml:space="preserve"> </w:t>
+      </w:r>
+      <w:r>
+        <w:t xml:space="preserve">and the router answers the same placement differently as soon as anything else</w:t>
+      </w:r>
+      <w:r>
+        <w:t xml:space="preserve"> </w:t>
+      </w:r>
+      <w:r>
+        <w:t xml:space="preserve">on the die changes. A prediction belongs to one routed database, so it has to</w:t>
+      </w:r>
+      <w:r>
+        <w:t xml:space="preserve"> </w:t>
+      </w:r>
+      <w:r>
+        <w:t xml:space="preserve">be read from the build that is actually fabricated. On an open shuttle that is</w:t>
+      </w:r>
+      <w:r>
+        <w:t xml:space="preserve"> </w:t>
+      </w:r>
+      <w:r>
+        <w:t xml:space="preserve">the build whose files are published.</w:t>
+      </w:r>
+    </w:p>
+    <w:p>
+      <w:pPr>
+        <w:pStyle w:val="BodyText"/>
+      </w:pPr>
+      <w:r>
+        <w:t xml:space="preserve">The third arm asks the question the other way round. Arm C’s sixteen rings</w:t>
+      </w:r>
+      <w:r>
+        <w:t xml:space="preserve"> </w:t>
+      </w:r>
+      <w:r>
+        <w:t xml:space="preserve">carry 9.90 fF of loop capacitance on average with a standard deviation of 0.55,</w:t>
+      </w:r>
+      <w:r>
+        <w:t xml:space="preserve"> </w:t>
+      </w:r>
+      <w:r>
+        <w:t xml:space="preserve">against 14.66 and 1.77 for Arm A on the same die. Their frequencies spread</w:t>
+      </w:r>
+      <w:r>
+        <w:t xml:space="preserve"> </w:t>
+      </w:r>
+      <w:r>
+        <w:t xml:space="preserve">2.19% peak to peak under the full RC network, 566.9 to 579.4 MHz, where Arm A’s</w:t>
+      </w:r>
+      <w:r>
+        <w:t xml:space="preserve"> </w:t>
+      </w:r>
+      <w:r>
+        <w:t xml:space="preserve">spread 5.88%, and the standard deviation of the sixteen is 0.36 of Arm A’s.</w:t>
+      </w:r>
+      <w:r>
+        <w:t xml:space="preserve"> </w:t>
+      </w:r>
+      <w:r>
+        <w:t xml:space="preserve">Placing the rings by hand takes out about two thirds of the spread.</w:t>
+      </w:r>
+    </w:p>
+    <w:p>
+      <w:pPr>
+        <w:pStyle w:val="BodyText"/>
+      </w:pPr>
+      <w:r>
+        <w:t xml:space="preserve">It takes out none of the predictability. Arm C’s closest pair is 0.321% apart,</w:t>
+      </w:r>
+      <w:r>
+        <w:t xml:space="preserve"> </w:t>
+      </w:r>
+      <w:r>
+        <w:t xml:space="preserve">3.7 mismatch standard deviations, the arm holds 0.00 bits of 8 and a reader</w:t>
+      </w:r>
+      <w:r>
+        <w:t xml:space="preserve"> </w:t>
+      </w:r>
+      <w:r>
+        <w:t xml:space="preserve">calls 8.00. Under the lumped decks the closest pair is 2.3 standard deviations</w:t>
+      </w:r>
+      <w:r>
+        <w:t xml:space="preserve"> </w:t>
+      </w:r>
+      <w:r>
+        <w:t xml:space="preserve">out and the arm holds 0.09 bits, which is still close to nothing. Its bits,</w:t>
+      </w:r>
+      <w:r>
+        <w:t xml:space="preserve"> </w:t>
+      </w:r>
+      <w:r>
+        <w:rPr>
+          <w:rStyle w:val="VerbatimChar"/>
+        </w:rPr>
+        <w:t xml:space="preserve">11010110</w:t>
+      </w:r>
+      <w:r>
+        <w:t xml:space="preserve">, are the same at ss, tt and ff. A tighter arm only hides bits once</w:t>
+      </w:r>
+      <w:r>
+        <w:t xml:space="preserve"> </w:t>
+      </w:r>
+      <w:r>
+        <w:t xml:space="preserve">its pair gaps fall under the mismatch scale, and a third of Arm A’s spread is</w:t>
+      </w:r>
+      <w:r>
+        <w:t xml:space="preserve"> </w:t>
+      </w:r>
+      <w:r>
+        <w:t xml:space="preserve">nowhere near that.</w:t>
+      </w:r>
+    </w:p>
+    <w:p>
+      <w:pPr>
+        <w:pStyle w:val="BodyText"/>
+      </w:pPr>
+      <w:r>
+        <w:rPr>
+          <w:rStyle w:val="VerbatimChar"/>
+        </w:rPr>
+        <w:t xml:space="preserve">predictable_bits.py</w:t>
+      </w:r>
+      <w:r>
+        <w:t xml:space="preserve"> </w:t>
+      </w:r>
+      <w:r>
+        <w:t xml:space="preserve">makes the table from the release build’s files, and</w:t>
+      </w:r>
+      <w:r>
+        <w:t xml:space="preserve"> </w:t>
+      </w:r>
+      <w:r>
+        <w:rPr>
+          <w:rStyle w:val="VerbatimChar"/>
+        </w:rPr>
+        <w:t xml:space="preserve">verify_predictability.py</w:t>
+      </w:r>
+      <w:r>
+        <w:t xml:space="preserve"> </w:t>
+      </w:r>
+      <w:r>
+        <w:t xml:space="preserve">re-derives its totals, its two closest pairs and the</w:t>
+      </w:r>
+      <w:r>
+        <w:t xml:space="preserve"> </w:t>
+      </w:r>
+      <w:r>
+        <w:t xml:space="preserve">Arm C figures with separate code. CI rebuilds both frequency tables from the</w:t>
+      </w:r>
+      <w:r>
+        <w:t xml:space="preserve"> </w:t>
+      </w:r>
+      <w:r>
+        <w:t xml:space="preserve">archived decks and checks them against the committed copies.</w:t>
+      </w:r>
+    </w:p>
+    <w:bookmarkEnd w:id="57"/>
+    <w:bookmarkEnd w:id="58"/>
+    <w:bookmarkStart w:id="67" w:name="matched-macro-arm"/>
     <w:p>
       <w:pPr>
         <w:pStyle w:val="Heading2"/>
@@ -7066,7 +8167,7 @@
         <w:t xml:space="preserve">8. Matched-macro arm</w:t>
       </w:r>
     </w:p>
-    <w:bookmarkStart w:id="61" w:name="one-macro-sixteen-instances"/>
+    <w:bookmarkStart w:id="65" w:name="one-macro-sixteen-instances"/>
     <w:p>
       <w:pPr>
         <w:pStyle w:val="Heading3"/>
@@ -7219,7 +8320,7 @@
         <w:t xml:space="preserve"> </w:t>
       </w:r>
       <w:r>
-        <w:t xml:space="preserve">candidate build reaches 570.7 MHz because the router happened to give it 10.9</w:t>
+        <w:t xml:space="preserve">baseline build reaches 570.7 MHz because the router happened to give it 10.9</w:t>
       </w:r>
       <w:r>
         <w:t xml:space="preserve"> </w:t>
@@ -7389,18 +8490,18 @@
           <wp:inline>
             <wp:extent cx="5334000" cy="2319130"/>
             <wp:effectExtent b="0" l="0" r="0" t="0"/>
-            <wp:docPr descr="Figure 6. The earlier 32-oscillator array beside the matched-macro reference line at 569.5 MHz, both under the lumped-capacitance model. The macro’s distributed-RC figure is 566.05 MHz; see Section 5.5." title="" id="56" name="Picture"/>
+            <wp:docPr descr="Figure 6. The earlier 32-oscillator array beside the matched-macro reference line at 569.5 MHz, both under the lumped-capacitance model. The macro’s distributed-RC figure is 566.05 MHz; see Section 5.5." title="" id="60" name="Picture"/>
             <a:graphic>
               <a:graphicData uri="http://schemas.openxmlformats.org/drawingml/2006/picture">
                 <pic:pic>
                   <pic:nvPicPr>
-                    <pic:cNvPr descr="../sim/spice/gono/armB_prediction.png" id="57" name="Picture"/>
+                    <pic:cNvPr descr="../sim/spice/gono/armB_prediction.png" id="61" name="Picture"/>
                     <pic:cNvPicPr>
                       <a:picLocks noChangeArrowheads="1" noChangeAspect="1"/>
                     </pic:cNvPicPr>
                   </pic:nvPicPr>
                   <pic:blipFill>
-                    <a:blip r:embed="rId55"/>
+                    <a:blip r:embed="rId59"/>
                     <a:stretch>
                       <a:fillRect/>
                     </a:stretch>
@@ -7444,18 +8545,18 @@
           <wp:inline>
             <wp:extent cx="5334000" cy="2319130"/>
             <wp:effectExtent b="0" l="0" r="0" t="0"/>
-            <wp:docPr descr="Figure 7. Arm A of the candidate build (5.53% peak to peak) beside the matched-macro reference line." title="" id="59" name="Picture"/>
+            <wp:docPr descr="Figure 7. Arm A of the baseline build (5.53% peak to peak) beside the matched-macro reference line." title="" id="63" name="Picture"/>
             <a:graphic>
               <a:graphicData uri="http://schemas.openxmlformats.org/drawingml/2006/picture">
                 <pic:pic>
                   <pic:nvPicPr>
-                    <pic:cNvPr descr="../sim/spice/gono/dualarm_gono.png" id="60" name="Picture"/>
+                    <pic:cNvPr descr="../sim/spice/gono/dualarm_gono.png" id="64" name="Picture"/>
                     <pic:cNvPicPr>
                       <a:picLocks noChangeArrowheads="1" noChangeAspect="1"/>
                     </pic:cNvPicPr>
                   </pic:nvPicPr>
                   <pic:blipFill>
-                    <a:blip r:embed="rId58"/>
+                    <a:blip r:embed="rId62"/>
                     <a:stretch>
                       <a:fillRect/>
                     </a:stretch>
@@ -7487,11 +8588,11 @@
         <w:pStyle w:val="ImageCaption"/>
       </w:pPr>
       <w:r>
-        <w:t xml:space="preserve">Figure 7. Arm A of the candidate build (5.53% peak to peak) beside the matched-macro reference line.</w:t>
-      </w:r>
-    </w:p>
-    <w:bookmarkEnd w:id="61"/>
-    <w:bookmarkStart w:id="62" w:name="is-anything-left-and-could-anyone-use-it"/>
+        <w:t xml:space="preserve">Figure 7. Arm A of the baseline build (5.53% peak to peak) beside the matched-macro reference line.</w:t>
+      </w:r>
+    </w:p>
+    <w:bookmarkEnd w:id="65"/>
+    <w:bookmarkStart w:id="66" w:name="is-anything-left-and-could-anyone-use-it"/>
     <w:p>
       <w:pPr>
         <w:pStyle w:val="Heading3"/>
@@ -7915,7 +9016,7 @@
               <w:jc w:val="left"/>
             </w:pPr>
             <w:r>
-              <w:t xml:space="preserve">Arm A, full RC</w:t>
+              <w:t xml:space="preserve">Arm A, full RC, baseline</w:t>
             </w:r>
           </w:p>
         </w:tc>
@@ -8040,10 +9141,22 @@
       <w:r>
         <w:t xml:space="preserve">.</w:t>
       </w:r>
-    </w:p>
-    <w:bookmarkEnd w:id="62"/>
-    <w:bookmarkEnd w:id="63"/>
-    <w:bookmarkStart w:id="64" w:name="planned-silicon-test"/>
+      <w:r>
+        <w:t xml:space="preserve"> </w:t>
+      </w:r>
+      <w:r>
+        <w:t xml:space="preserve">The routes are the baseline’s, too. The release build drew every one of them</w:t>
+      </w:r>
+      <w:r>
+        <w:t xml:space="preserve"> </w:t>
+      </w:r>
+      <w:r>
+        <w:t xml:space="preserve">again, and the sixteen have not been run on those yet.</w:t>
+      </w:r>
+    </w:p>
+    <w:bookmarkEnd w:id="66"/>
+    <w:bookmarkEnd w:id="67"/>
+    <w:bookmarkStart w:id="68" w:name="planned-silicon-test"/>
     <w:p>
       <w:pPr>
         <w:pStyle w:val="Heading2"/>
@@ -8063,25 +9176,64 @@
         <w:t xml:space="preserve"> </w:t>
       </w:r>
       <w:r>
-        <w:t xml:space="preserve">the main reason to build the chip. The prediction is specific. On every die of</w:t>
-      </w:r>
-      <w:r>
-        <w:t xml:space="preserve"> </w:t>
-      </w:r>
-      <w:r>
-        <w:t xml:space="preserve">this design the six high-margin Arm A pairs should return the sign the</w:t>
-      </w:r>
-      <w:r>
-        <w:t xml:space="preserve"> </w:t>
-      </w:r>
-      <w:r>
-        <w:t xml:space="preserve">extraction gives them, the two low-margin pairs should not, and the Arm B pairs</w:t>
-      </w:r>
-      <w:r>
-        <w:t xml:space="preserve"> </w:t>
-      </w:r>
-      <w:r>
-        <w:t xml:space="preserve">should behave like coin flips that repeat within a die and differ between dies.</w:t>
+        <w:t xml:space="preserve">the main reason to build the chip. The prediction is specific, and it is made</w:t>
+      </w:r>
+      <w:r>
+        <w:t xml:space="preserve"> </w:t>
+      </w:r>
+      <w:r>
+        <w:t xml:space="preserve">for the release build of Section 7.4, since that is the one being fabricated.</w:t>
+      </w:r>
+      <w:r>
+        <w:t xml:space="preserve"> </w:t>
+      </w:r>
+      <w:r>
+        <w:t xml:space="preserve">On every die, all eight Arm A pairs and all eight Arm C pairs should return the</w:t>
+      </w:r>
+      <w:r>
+        <w:t xml:space="preserve"> </w:t>
+      </w:r>
+      <w:r>
+        <w:t xml:space="preserve">signs the extraction gives them,</w:t>
+      </w:r>
+      <w:r>
+        <w:t xml:space="preserve"> </w:t>
+      </w:r>
+      <w:r>
+        <w:rPr>
+          <w:rStyle w:val="VerbatimChar"/>
+        </w:rPr>
+        <w:t xml:space="preserve">11100000</w:t>
+      </w:r>
+      <w:r>
+        <w:t xml:space="preserve"> </w:t>
+      </w:r>
+      <w:r>
+        <w:t xml:space="preserve">and</w:t>
+      </w:r>
+      <w:r>
+        <w:t xml:space="preserve"> </w:t>
+      </w:r>
+      <w:r>
+        <w:rPr>
+          <w:rStyle w:val="VerbatimChar"/>
+        </w:rPr>
+        <w:t xml:space="preserve">11010110</w:t>
+      </w:r>
+      <w:r>
+        <w:t xml:space="preserve">, with Arm A’s pair</w:t>
+      </w:r>
+      <w:r>
+        <w:t xml:space="preserve"> </w:t>
+      </w:r>
+      <w:r>
+        <w:t xml:space="preserve">2/3 the least certain at 2.4 standard deviations. The Arm B pairs should behave</w:t>
+      </w:r>
+      <w:r>
+        <w:t xml:space="preserve"> </w:t>
+      </w:r>
+      <w:r>
+        <w:t xml:space="preserve">like coin flips that repeat within a die and differ between dies.</w:t>
       </w:r>
     </w:p>
     <w:p>
@@ -8113,13 +9265,13 @@
         <w:t xml:space="preserve"> </w:t>
       </w:r>
       <w:r>
-        <w:t xml:space="preserve">the same thing happens here, the six fixed bits stop being fixed, and the</w:t>
-      </w:r>
-      <w:r>
-        <w:t xml:space="preserve"> </w:t>
-      </w:r>
-      <w:r>
-        <w:t xml:space="preserve">entropy figure moves back toward 8.</w:t>
+        <w:t xml:space="preserve">the same thing happens here, the fixed bits stop being fixed, and the entropy</w:t>
+      </w:r>
+      <w:r>
+        <w:t xml:space="preserve"> </w:t>
+      </w:r>
+      <w:r>
+        <w:t xml:space="preserve">figure moves back toward 8.</w:t>
       </w:r>
     </w:p>
     <w:p>
@@ -8271,8 +9423,8 @@
         <w:t xml:space="preserve">oscillator vector does not support a population claim.</w:t>
       </w:r>
     </w:p>
-    <w:bookmarkEnd w:id="64"/>
-    <w:bookmarkStart w:id="65" w:name="limitations"/>
+    <w:bookmarkEnd w:id="68"/>
+    <w:bookmarkStart w:id="69" w:name="limitations"/>
     <w:p>
       <w:pPr>
         <w:pStyle w:val="Heading2"/>
@@ -8284,6 +9436,38 @@
     <w:p>
       <w:pPr>
         <w:pStyle w:val="FirstParagraph"/>
+      </w:pPr>
+      <w:r>
+        <w:t xml:space="preserve">Most of it was measured on a build that is not the one being made. The release</w:t>
+      </w:r>
+      <w:r>
+        <w:t xml:space="preserve"> </w:t>
+      </w:r>
+      <w:r>
+        <w:t xml:space="preserve">build has had its corner sweep, its full RC comparison and the bit count of</w:t>
+      </w:r>
+      <w:r>
+        <w:t xml:space="preserve"> </w:t>
+      </w:r>
+      <w:r>
+        <w:t xml:space="preserve">Section 7.1 repeated, in Section 7.4, and none of the rest of this paper. The</w:t>
+      </w:r>
+      <w:r>
+        <w:t xml:space="preserve"> </w:t>
+      </w:r>
+      <w:r>
+        <w:t xml:space="preserve">compensation, the re-pairing, the resolution floor and the Arm B instances are</w:t>
+      </w:r>
+      <w:r>
+        <w:t xml:space="preserve"> </w:t>
+      </w:r>
+      <w:r>
+        <w:t xml:space="preserve">the baseline’s, and whether their numbers carry over I have not tested yet.</w:t>
+      </w:r>
+    </w:p>
+    <w:p>
+      <w:pPr>
+        <w:pStyle w:val="BodyText"/>
       </w:pPr>
       <w:r>
         <w:t xml:space="preserve">This study is pre-silicon, and its model is deliberately simple. Nominal</w:t>
@@ -9161,8 +10345,8 @@
         <w:t xml:space="preserve">numbers here describe the raw response and not a fielded key.</w:t>
       </w:r>
     </w:p>
-    <w:bookmarkEnd w:id="65"/>
-    <w:bookmarkStart w:id="66" w:name="conclusion"/>
+    <w:bookmarkEnd w:id="69"/>
+    <w:bookmarkStart w:id="70" w:name="conclusion"/>
     <w:p>
       <w:pPr>
         <w:pStyle w:val="Heading2"/>
@@ -9176,45 +10360,81 @@
         <w:pStyle w:val="FirstParagraph"/>
       </w:pPr>
       <w:r>
-        <w:t xml:space="preserve">For the design going to this shuttle, the public files decide most of the</w:t>
-      </w:r>
-      <w:r>
-        <w:t xml:space="preserve"> </w:t>
-      </w:r>
-      <w:r>
-        <w:t xml:space="preserve">response. Six of Arm A’s eight adjacent-pair bits carry under a hundredth of a</w:t>
-      </w:r>
-      <w:r>
-        <w:t xml:space="preserve"> </w:t>
-      </w:r>
-      <w:r>
-        <w:t xml:space="preserve">bit of across-die entropy under a first-order 0.062% per-ring mismatch</w:t>
-      </w:r>
-      <w:r>
-        <w:t xml:space="preserve"> </w:t>
-      </w:r>
-      <w:r>
-        <w:t xml:space="preserve">estimate.</w:t>
-      </w:r>
-    </w:p>
-    <w:p>
-      <w:pPr>
-        <w:pStyle w:val="BodyText"/>
-      </w:pPr>
-      <w:r>
-        <w:t xml:space="preserve">The arm holds 0.46 bits of 8. A reader of the design database alone would call</w:t>
-      </w:r>
-      <w:r>
-        <w:t xml:space="preserve"> </w:t>
-      </w:r>
-      <w:r>
-        <w:t xml:space="preserve">7.91 of the 8 correctly, and across the sampling interval of that estimate the</w:t>
-      </w:r>
-      <w:r>
-        <w:t xml:space="preserve"> </w:t>
-      </w:r>
-      <w:r>
-        <w:t xml:space="preserve">range runs 0.30 to 0.69 bits and 7.84 to 7.95 guessed.</w:t>
+        <w:t xml:space="preserve">For the design going to this shuttle, the public files decide almost all of</w:t>
+      </w:r>
+      <w:r>
+        <w:t xml:space="preserve"> </w:t>
+      </w:r>
+      <w:r>
+        <w:t xml:space="preserve">the response. On the release build seven of Arm A’s eight adjacent-pair bits</w:t>
+      </w:r>
+      <w:r>
+        <w:t xml:space="preserve"> </w:t>
+      </w:r>
+      <w:r>
+        <w:t xml:space="preserve">carry under a hundredth of a bit of across-die entropy under a first-order</w:t>
+      </w:r>
+      <w:r>
+        <w:t xml:space="preserve"> </w:t>
+      </w:r>
+      <w:r>
+        <w:t xml:space="preserve">0.062% per-ring mismatch estimate. The arm holds 0.07 bits of 8, and a reader</w:t>
+      </w:r>
+      <w:r>
+        <w:t xml:space="preserve"> </w:t>
+      </w:r>
+      <w:r>
+        <w:t xml:space="preserve">of the design database alone would call 7.99 of the 8 correctly, 0.02 to 0.22</w:t>
+      </w:r>
+      <w:r>
+        <w:t xml:space="preserve"> </w:t>
+      </w:r>
+      <w:r>
+        <w:t xml:space="preserve">bits and 7.97 to 8.00 across the sampling interval of that estimate. The</w:t>
+      </w:r>
+      <w:r>
+        <w:t xml:space="preserve"> </w:t>
+      </w:r>
+      <w:r>
+        <w:t xml:space="preserve">hand-placed third arm spreads a third as much and holds 0.00 bits.</w:t>
+      </w:r>
+    </w:p>
+    <w:p>
+      <w:pPr>
+        <w:pStyle w:val="BodyText"/>
+      </w:pPr>
+      <w:r>
+        <w:t xml:space="preserve">The method was worked out on the two-arm baseline, where the same count gives</w:t>
+      </w:r>
+      <w:r>
+        <w:t xml:space="preserve"> </w:t>
+      </w:r>
+      <w:r>
+        <w:t xml:space="preserve">0.46 bits of 8 and 7.91 called, and 0.30 to 0.69 bits and 7.84 to 7.95 across</w:t>
+      </w:r>
+      <w:r>
+        <w:t xml:space="preserve"> </w:t>
+      </w:r>
+      <w:r>
+        <w:t xml:space="preserve">the interval. The two builds share their placement and differ only in wiring,</w:t>
+      </w:r>
+      <w:r>
+        <w:t xml:space="preserve"> </w:t>
+      </w:r>
+      <w:r>
+        <w:t xml:space="preserve">and two of the eight bits changed between them. That is the plainest evidence</w:t>
+      </w:r>
+      <w:r>
+        <w:t xml:space="preserve"> </w:t>
+      </w:r>
+      <w:r>
+        <w:t xml:space="preserve">here that a reader needs the target’s own extraction. The rest of this section</w:t>
+      </w:r>
+      <w:r>
+        <w:t xml:space="preserve"> </w:t>
+      </w:r>
+      <w:r>
+        <w:t xml:space="preserve">is about the baseline.</w:t>
       </w:r>
     </w:p>
     <w:p>
@@ -9298,19 +10518,19 @@
         <w:t xml:space="preserve"> </w:t>
       </w:r>
       <w:r>
-        <w:t xml:space="preserve">build and never refitted removes 88.2% of the shipped build’s spread against</w:t>
-      </w:r>
-      <w:r>
-        <w:t xml:space="preserve"> </w:t>
-      </w:r>
-      <w:r>
-        <w:t xml:space="preserve">89.5% for a corrector cross-validated on the shipped build itself, and it calls</w:t>
-      </w:r>
-      <w:r>
-        <w:t xml:space="preserve"> </w:t>
-      </w:r>
-      <w:r>
-        <w:t xml:space="preserve">all eight bits the same way, so the 7.91 does not change.</w:t>
+        <w:t xml:space="preserve">build and never refitted removes 88.2% of the baseline build’s spread against</w:t>
+      </w:r>
+      <w:r>
+        <w:t xml:space="preserve"> </w:t>
+      </w:r>
+      <w:r>
+        <w:t xml:space="preserve">89.5% for a corrector cross-validated on the baseline build itself, and it</w:t>
+      </w:r>
+      <w:r>
+        <w:t xml:space="preserve"> </w:t>
+      </w:r>
+      <w:r>
+        <w:t xml:space="preserve">calls all eight bits the same way, so the 7.91 does not change.</w:t>
       </w:r>
     </w:p>
     <w:p>
@@ -9540,7 +10760,13 @@
         <w:t xml:space="preserve"> </w:t>
       </w:r>
       <w:r>
-        <w:t xml:space="preserve">calling 4.02 against 4.00 for guessing.</w:t>
+        <w:t xml:space="preserve">calling 4.02 against 4.00 for guessing. Those were the baseline’s routes, and</w:t>
+      </w:r>
+      <w:r>
+        <w:t xml:space="preserve"> </w:t>
+      </w:r>
+      <w:r>
+        <w:t xml:space="preserve">the release build’s are still to be run.</w:t>
       </w:r>
     </w:p>
     <w:p>
@@ -9574,17 +10800,17 @@
         <w:t xml:space="preserve"> </w:t>
       </w:r>
       <w:r>
-        <w:t xml:space="preserve">chips exist, so measuring both arms of the fabricated parts either confirms</w:t>
-      </w:r>
-      <w:r>
-        <w:t xml:space="preserve"> </w:t>
-      </w:r>
-      <w:r>
-        <w:t xml:space="preserve">them or refutes them, and a refutation would teach me as much.</w:t>
-      </w:r>
-    </w:p>
-    <w:bookmarkEnd w:id="66"/>
-    <w:bookmarkStart w:id="67" w:name="references"/>
+        <w:t xml:space="preserve">chips exist, so measuring the three arms of the fabricated parts either</w:t>
+      </w:r>
+      <w:r>
+        <w:t xml:space="preserve"> </w:t>
+      </w:r>
+      <w:r>
+        <w:t xml:space="preserve">confirms them or refutes them, and a refutation would teach me as much.</w:t>
+      </w:r>
+    </w:p>
+    <w:bookmarkEnd w:id="70"/>
+    <w:bookmarkStart w:id="71" w:name="references"/>
     <w:p>
       <w:pPr>
         <w:pStyle w:val="Heading2"/>
@@ -10623,8 +11849,8 @@
         <w:t xml:space="preserve">no. 8, pp. 1126-1141, 2014. https://doi.org/10.1109/JPROC.2014.2320516</w:t>
       </w:r>
     </w:p>
-    <w:bookmarkEnd w:id="67"/>
-    <w:bookmarkEnd w:id="68"/>
+    <w:bookmarkEnd w:id="71"/>
+    <w:bookmarkEnd w:id="72"/>
     <w:sectPr/>
   </w:body>
 </w:document>

</xml_diff>

<commit_message>
fix numbers in signoff paper and datasheet
</commit_message>
<xml_diff>
--- a/docs/paper/SILICON_paper.docx
+++ b/docs/paper/SILICON_paper.docx
@@ -72,19 +72,25 @@
         <w:t xml:space="preserve"> </w:t>
       </w:r>
       <w:r>
-        <w:t xml:space="preserve">other way. The abstract and Section 7.4 give the release build’s numbers.</w:t>
-      </w:r>
-      <w:r>
-        <w:t xml:space="preserve"> </w:t>
-      </w:r>
-      <w:r>
-        <w:t xml:space="preserve">Everything else was measured on the two-arm build, which this revision calls</w:t>
-      </w:r>
-      <w:r>
-        <w:t xml:space="preserve"> </w:t>
-      </w:r>
-      <w:r>
-        <w:t xml:space="preserve">the baseline, and has not been repeated.</w:t>
+        <w:t xml:space="preserve">other way. The abstract and Section 7.4 give the release build’s numbers, and</w:t>
+      </w:r>
+      <w:r>
+        <w:t xml:space="preserve"> </w:t>
+      </w:r>
+      <w:r>
+        <w:t xml:space="preserve">a few sentences elsewhere say where it differs. Everything else was measured on</w:t>
+      </w:r>
+      <w:r>
+        <w:t xml:space="preserve"> </w:t>
+      </w:r>
+      <w:r>
+        <w:t xml:space="preserve">the two-arm build, which this revision calls the baseline, and has not been</w:t>
+      </w:r>
+      <w:r>
+        <w:t xml:space="preserve"> </w:t>
+      </w:r>
+      <w:r>
+        <w:t xml:space="preserve">repeated.</w:t>
       </w:r>
     </w:p>
     <w:p>
@@ -204,13 +210,13 @@
         <w:t xml:space="preserve"> </w:t>
       </w:r>
       <w:r>
-        <w:t xml:space="preserve">worked out, same cells at the same coordinates and different wires, the same</w:t>
-      </w:r>
-      <w:r>
-        <w:t xml:space="preserve"> </w:t>
-      </w:r>
-      <w:r>
-        <w:t xml:space="preserve">count gives 0.46 bits and 7.91.</w:t>
+        <w:t xml:space="preserve">worked out, the same Arm A cells at the same coordinates with different</w:t>
+      </w:r>
+      <w:r>
+        <w:t xml:space="preserve"> </w:t>
+      </w:r>
+      <w:r>
+        <w:t xml:space="preserve">wires, the same count gives 0.46 bits and 7.91.</w:t>
       </w:r>
     </w:p>
     <w:p>
@@ -1905,13 +1911,19 @@
         <w:t xml:space="preserve"> </w:t>
       </w:r>
       <w:r>
-        <w:t xml:space="preserve">Only the wiring was done again. It passes the same physical checks with zero</w:t>
-      </w:r>
-      <w:r>
-        <w:t xml:space="preserve"> </w:t>
-      </w:r>
-      <w:r>
-        <w:t xml:space="preserve">violations. Figure 1b shows it and Section 7.4 scores it.</w:t>
+        <w:t xml:space="preserve">Their wiring was done again, around the new arm and the bigger selector. It</w:t>
+      </w:r>
+      <w:r>
+        <w:t xml:space="preserve"> </w:t>
+      </w:r>
+      <w:r>
+        <w:t xml:space="preserve">passes the same physical checks with zero violations. Figure 1b shows it and</w:t>
+      </w:r>
+      <w:r>
+        <w:t xml:space="preserve"> </w:t>
+      </w:r>
+      <w:r>
+        <w:t xml:space="preserve">Section 7.4 scores it.</w:t>
       </w:r>
     </w:p>
     <w:p>
@@ -3156,25 +3168,31 @@
         <w:t xml:space="preserve"> </w:t>
       </w:r>
       <w:r>
-        <w:t xml:space="preserve">wrap latches a flag rather than passing as a reading. At the 2048 cycles and 50</w:t>
-      </w:r>
-      <w:r>
-        <w:t xml:space="preserve"> </w:t>
-      </w:r>
-      <w:r>
-        <w:t xml:space="preserve">MHz the measurement firmware uses, the fastest ring on the release build, an</w:t>
-      </w:r>
-      <w:r>
-        <w:t xml:space="preserve"> </w:t>
-      </w:r>
-      <w:r>
-        <w:t xml:space="preserve">Arm C ring at 911.1 MHz at the fast corner, reads 37318, 1.76x under the</w:t>
-      </w:r>
-      <w:r>
-        <w:t xml:space="preserve"> </w:t>
-      </w:r>
-      <w:r>
-        <w:t xml:space="preserve">ceiling, and the clock would have to fall below 28.5 MHz before it wrapped.</w:t>
+        <w:t xml:space="preserve">wrap latches a flag rather than passing as a reading. Its fastest ring is not</w:t>
+      </w:r>
+      <w:r>
+        <w:t xml:space="preserve"> </w:t>
+      </w:r>
+      <w:r>
+        <w:t xml:space="preserve">an Arm A ring, which is why this paragraph steps outside the section: at the</w:t>
+      </w:r>
+      <w:r>
+        <w:t xml:space="preserve"> </w:t>
+      </w:r>
+      <w:r>
+        <w:t xml:space="preserve">2048 cycles and 50 MHz the measurement firmware uses, an Arm C ring at 911.1</w:t>
+      </w:r>
+      <w:r>
+        <w:t xml:space="preserve"> </w:t>
+      </w:r>
+      <w:r>
+        <w:t xml:space="preserve">MHz at the fast corner reads 37318, 1.76x under the ceiling, and the clock</w:t>
+      </w:r>
+      <w:r>
+        <w:t xml:space="preserve"> </w:t>
+      </w:r>
+      <w:r>
+        <w:t xml:space="preserve">would have to fall below 28.5 MHz before it wrapped.</w:t>
       </w:r>
     </w:p>
     <w:bookmarkEnd w:id="40"/>
@@ -7959,31 +7977,37 @@
         <w:t xml:space="preserve">11100000</w:t>
       </w:r>
       <w:r>
-        <w:t xml:space="preserve">: pairs 0 and 4 flip, the same way at ss, tt and ff and under both</w:t>
-      </w:r>
-      <w:r>
-        <w:t xml:space="preserve"> </w:t>
-      </w:r>
-      <w:r>
-        <w:t xml:space="preserve">parasitic models. Nothing changed between the builds but wire. The router took</w:t>
-      </w:r>
-      <w:r>
-        <w:t xml:space="preserve"> </w:t>
-      </w:r>
-      <w:r>
-        <w:t xml:space="preserve">different paths to the same cells, one ring’s loop capacitance moved by 3.4 fF,</w:t>
-      </w:r>
-      <w:r>
-        <w:t xml:space="preserve"> </w:t>
-      </w:r>
-      <w:r>
-        <w:t xml:space="preserve">and the rank correlation between the two builds’ sixteen loop capacitances is</w:t>
-      </w:r>
-      <w:r>
-        <w:t xml:space="preserve"> </w:t>
-      </w:r>
-      <w:r>
-        <w:t xml:space="preserve">0.71.</w:t>
+        <w:t xml:space="preserve">: pairs 0/1 and 8/9 flip, the same way at ss, tt and ff and under</w:t>
+      </w:r>
+      <w:r>
+        <w:t xml:space="preserve"> </w:t>
+      </w:r>
+      <w:r>
+        <w:t xml:space="preserve">both parasitic models. Nothing about Arm A changed between the builds but its</w:t>
+      </w:r>
+      <w:r>
+        <w:t xml:space="preserve"> </w:t>
+      </w:r>
+      <w:r>
+        <w:t xml:space="preserve">wires. The router took different paths to the same cells, on a die that now</w:t>
+      </w:r>
+      <w:r>
+        <w:t xml:space="preserve"> </w:t>
+      </w:r>
+      <w:r>
+        <w:t xml:space="preserve">also held Arm C and a bigger selector; one ring’s loop capacitance moved by 3.4</w:t>
+      </w:r>
+      <w:r>
+        <w:t xml:space="preserve"> </w:t>
+      </w:r>
+      <w:r>
+        <w:t xml:space="preserve">fF, and the rank correlation between the two builds’ sixteen loop capacitances</w:t>
+      </w:r>
+      <w:r>
+        <w:t xml:space="preserve"> </w:t>
+      </w:r>
+      <w:r>
+        <w:t xml:space="preserve">is 0.71.</w:t>
       </w:r>
     </w:p>
     <w:p>
@@ -8055,37 +8079,45 @@
       <w:r>
         <w:t xml:space="preserve">spread 5.88%, and the standard deviation of the sixteen is 0.36 of Arm A’s.</w:t>
       </w:r>
-      <w:r>
-        <w:t xml:space="preserve"> </w:t>
-      </w:r>
-      <w:r>
-        <w:t xml:space="preserve">Placing the rings by hand takes out about two thirds of the spread.</w:t>
-      </w:r>
-    </w:p>
-    <w:p>
-      <w:pPr>
-        <w:pStyle w:val="BodyText"/>
-      </w:pPr>
-      <w:r>
-        <w:t xml:space="preserve">It takes out none of the predictability. Arm C’s closest pair is 0.321% apart,</w:t>
-      </w:r>
-      <w:r>
-        <w:t xml:space="preserve"> </w:t>
-      </w:r>
-      <w:r>
-        <w:t xml:space="preserve">3.7 mismatch standard deviations, the arm holds 0.00 bits of 8 and a reader</w:t>
-      </w:r>
-      <w:r>
-        <w:t xml:space="preserve"> </w:t>
-      </w:r>
-      <w:r>
-        <w:t xml:space="preserve">calls 8.00. Under the lumped decks the closest pair is 2.3 standard deviations</w:t>
-      </w:r>
-      <w:r>
-        <w:t xml:space="preserve"> </w:t>
-      </w:r>
-      <w:r>
-        <w:t xml:space="preserve">out and the arm holds 0.09 bits, which is still close to nothing. Its bits,</w:t>
+    </w:p>
+    <w:p>
+      <w:pPr>
+        <w:pStyle w:val="BodyText"/>
+      </w:pPr>
+      <w:r>
+        <w:t xml:space="preserve">Placing the rings by hand takes out about two thirds of the spread, and none of</w:t>
+      </w:r>
+      <w:r>
+        <w:t xml:space="preserve"> </w:t>
+      </w:r>
+      <w:r>
+        <w:t xml:space="preserve">the predictability.</w:t>
+      </w:r>
+    </w:p>
+    <w:p>
+      <w:pPr>
+        <w:pStyle w:val="BodyText"/>
+      </w:pPr>
+      <w:r>
+        <w:t xml:space="preserve">Arm C’s closest pair is 0.321% apart, 3.7 mismatch standard deviations, the arm</w:t>
+      </w:r>
+      <w:r>
+        <w:t xml:space="preserve"> </w:t>
+      </w:r>
+      <w:r>
+        <w:t xml:space="preserve">holds 0.00 bits of 8 and a reader calls 8.00. Under the lumped decks the</w:t>
+      </w:r>
+      <w:r>
+        <w:t xml:space="preserve"> </w:t>
+      </w:r>
+      <w:r>
+        <w:t xml:space="preserve">closest pair is 2.3 standard deviations out and the arm holds 0.09 bits, which</w:t>
+      </w:r>
+      <w:r>
+        <w:t xml:space="preserve"> </w:t>
+      </w:r>
+      <w:r>
+        <w:t xml:space="preserve">is still close to nothing. Its bits,</w:t>
       </w:r>
       <w:r>
         <w:t xml:space="preserve"> </w:t>
@@ -8097,19 +8129,19 @@
         <w:t xml:space="preserve">11010110</w:t>
       </w:r>
       <w:r>
-        <w:t xml:space="preserve">, are the same at ss, tt and ff. A tighter arm only hides bits once</w:t>
-      </w:r>
-      <w:r>
-        <w:t xml:space="preserve"> </w:t>
-      </w:r>
-      <w:r>
-        <w:t xml:space="preserve">its pair gaps fall under the mismatch scale, and a third of Arm A’s spread is</w:t>
-      </w:r>
-      <w:r>
-        <w:t xml:space="preserve"> </w:t>
-      </w:r>
-      <w:r>
-        <w:t xml:space="preserve">nowhere near that.</w:t>
+        <w:t xml:space="preserve">, are the same at ss, tt and ff.</w:t>
+      </w:r>
+      <w:r>
+        <w:t xml:space="preserve"> </w:t>
+      </w:r>
+      <w:r>
+        <w:t xml:space="preserve">A tighter arm only hides bits once its pair gaps fall under the mismatch scale,</w:t>
+      </w:r>
+      <w:r>
+        <w:t xml:space="preserve"> </w:t>
+      </w:r>
+      <w:r>
+        <w:t xml:space="preserve">and a third of Arm A’s spread is nowhere near that.</w:t>
       </w:r>
     </w:p>
     <w:p>
@@ -9450,19 +9482,25 @@
         <w:t xml:space="preserve"> </w:t>
       </w:r>
       <w:r>
-        <w:t xml:space="preserve">Section 7.1 repeated, in Section 7.4, and none of the rest of this paper. The</w:t>
-      </w:r>
-      <w:r>
-        <w:t xml:space="preserve"> </w:t>
-      </w:r>
-      <w:r>
-        <w:t xml:space="preserve">compensation, the re-pairing, the resolution floor and the Arm B instances are</w:t>
-      </w:r>
-      <w:r>
-        <w:t xml:space="preserve"> </w:t>
-      </w:r>
-      <w:r>
-        <w:t xml:space="preserve">the baseline’s, and whether their numbers carry over I have not tested yet.</w:t>
+        <w:t xml:space="preserve">Section 7.1 repeated in Section 7.4, and its counter range worked out in</w:t>
+      </w:r>
+      <w:r>
+        <w:t xml:space="preserve"> </w:t>
+      </w:r>
+      <w:r>
+        <w:t xml:space="preserve">Section 5.4, and that is all. The compensation, the re-pairing, the resolution</w:t>
+      </w:r>
+      <w:r>
+        <w:t xml:space="preserve"> </w:t>
+      </w:r>
+      <w:r>
+        <w:t xml:space="preserve">floor and the Arm B instances are the baseline’s, and whether their numbers</w:t>
+      </w:r>
+      <w:r>
+        <w:t xml:space="preserve"> </w:t>
+      </w:r>
+      <w:r>
+        <w:t xml:space="preserve">carry over I have not tested yet.</w:t>
       </w:r>
     </w:p>
     <w:p>
@@ -10416,13 +10454,13 @@
         <w:t xml:space="preserve"> </w:t>
       </w:r>
       <w:r>
-        <w:t xml:space="preserve">the interval. The two builds share their placement and differ only in wiring,</w:t>
-      </w:r>
-      <w:r>
-        <w:t xml:space="preserve"> </w:t>
-      </w:r>
-      <w:r>
-        <w:t xml:space="preserve">and two of the eight bits changed between them. That is the plainest evidence</w:t>
+        <w:t xml:space="preserve">the interval. Arm A has the same placement in both builds and different wiring,</w:t>
+      </w:r>
+      <w:r>
+        <w:t xml:space="preserve"> </w:t>
+      </w:r>
+      <w:r>
+        <w:t xml:space="preserve">and two of its eight bits changed between them. That is the plainest evidence</w:t>
       </w:r>
       <w:r>
         <w:t xml:space="preserve"> </w:t>

</xml_diff>

<commit_message>
boundary sweeps and arm b on the release build
</commit_message>
<xml_diff>
--- a/docs/paper/SILICON_paper.docx
+++ b/docs/paper/SILICON_paper.docx
@@ -34,7 +34,7 @@
         <w:pStyle w:val="BodyText"/>
       </w:pPr>
       <w:r>
-        <w:t xml:space="preserve">Draft, 2026-07-30, revised 2026-09-21</w:t>
+        <w:t xml:space="preserve">Draft, 2026-07-30, revised 2026-09-22</w:t>
       </w:r>
     </w:p>
     <w:p>
@@ -66,31 +66,31 @@
         <w:t xml:space="preserve"> </w:t>
       </w:r>
       <w:r>
-        <w:t xml:space="preserve">router wired that build again, and two of Arm A’s eight bits came out the</w:t>
-      </w:r>
-      <w:r>
-        <w:t xml:space="preserve"> </w:t>
-      </w:r>
-      <w:r>
-        <w:t xml:space="preserve">other way. The abstract and Section 7.4 give the release build’s numbers, and</w:t>
-      </w:r>
-      <w:r>
-        <w:t xml:space="preserve"> </w:t>
-      </w:r>
-      <w:r>
-        <w:t xml:space="preserve">a few sentences elsewhere say where it differs. Everything else was measured on</w:t>
-      </w:r>
-      <w:r>
-        <w:t xml:space="preserve"> </w:t>
-      </w:r>
-      <w:r>
-        <w:t xml:space="preserve">the two-arm build, which this revision calls the baseline, and has not been</w:t>
-      </w:r>
-      <w:r>
-        <w:t xml:space="preserve"> </w:t>
-      </w:r>
-      <w:r>
-        <w:t xml:space="preserve">repeated.</w:t>
+        <w:t xml:space="preserve">router wired that build again, and two of Arm A’s eight bits came out the other</w:t>
+      </w:r>
+      <w:r>
+        <w:t xml:space="preserve"> </w:t>
+      </w:r>
+      <w:r>
+        <w:t xml:space="preserve">way. The abstract, Section 7.4 and part of Section 8.1 give the release build’s</w:t>
+      </w:r>
+      <w:r>
+        <w:t xml:space="preserve"> </w:t>
+      </w:r>
+      <w:r>
+        <w:t xml:space="preserve">numbers, and a few sentences elsewhere say where it differs. Everything else</w:t>
+      </w:r>
+      <w:r>
+        <w:t xml:space="preserve"> </w:t>
+      </w:r>
+      <w:r>
+        <w:t xml:space="preserve">was measured on the two-arm build, which this revision calls the baseline, and</w:t>
+      </w:r>
+      <w:r>
+        <w:t xml:space="preserve"> </w:t>
+      </w:r>
+      <w:r>
+        <w:t xml:space="preserve">has not been repeated.</w:t>
       </w:r>
     </w:p>
     <w:p>
@@ -8442,25 +8442,75 @@
         <w:pStyle w:val="BodyText"/>
       </w:pPr>
       <w:r>
-        <w:t xml:space="preserve">The chip cannot resolve the difference between them even in principle. Read the</w:t>
-      </w:r>
-      <w:r>
-        <w:t xml:space="preserve"> </w:t>
-      </w:r>
-      <w:r>
-        <w:t xml:space="preserve">ss digits as an upper bound rather than a measurement: at that corner the</w:t>
-      </w:r>
-      <w:r>
-        <w:t xml:space="preserve"> </w:t>
-      </w:r>
-      <w:r>
-        <w:t xml:space="preserve">spread is 1.3e-6 of the mean and the log’s two definitions of frequency</w:t>
-      </w:r>
-      <w:r>
-        <w:t xml:space="preserve"> </w:t>
-      </w:r>
-      <w:r>
-        <w:t xml:space="preserve">disagree at 1.6e-7, so the third significant figure depends on which is read.</w:t>
+        <w:t xml:space="preserve">Those are the baseline’s routes. The release build drew every one of them</w:t>
+      </w:r>
+      <w:r>
+        <w:t xml:space="preserve"> </w:t>
+      </w:r>
+      <w:r>
+        <w:t xml:space="preserve">again, to the 48-input selector, and the longest output route grew from 29.5 to</w:t>
+      </w:r>
+      <w:r>
+        <w:t xml:space="preserve"> </w:t>
+      </w:r>
+      <w:r>
+        <w:t xml:space="preserve">45.4 fF. Run again on those, the sixteen spread 0.0033% at tt, 0.0001% at ss</w:t>
+      </w:r>
+      <w:r>
+        <w:t xml:space="preserve"> </w:t>
+      </w:r>
+      <w:r>
+        <w:t xml:space="preserve">and 0.0019% at ff, at most 0.76 of one count at the 2048 cycles and 50 MHz the</w:t>
+      </w:r>
+      <w:r>
+        <w:t xml:space="preserve"> </w:t>
+      </w:r>
+      <w:r>
+        <w:t xml:space="preserve">release firmware uses, and at least three orders of magnitude under that</w:t>
+      </w:r>
+      <w:r>
+        <w:t xml:space="preserve"> </w:t>
+      </w:r>
+      <w:r>
+        <w:t xml:space="preserve">build’s Arm A.</w:t>
+      </w:r>
+    </w:p>
+    <w:p>
+      <w:pPr>
+        <w:pStyle w:val="BodyText"/>
+      </w:pPr>
+      <w:r>
+        <w:t xml:space="preserve">At the setting each build is measured with, a single reading cannot resolve the</w:t>
+      </w:r>
+      <w:r>
+        <w:t xml:space="preserve"> </w:t>
+      </w:r>
+      <w:r>
+        <w:t xml:space="preserve">difference between them. Read the ss digits as an upper bound rather than a</w:t>
+      </w:r>
+      <w:r>
+        <w:t xml:space="preserve"> </w:t>
+      </w:r>
+      <w:r>
+        <w:t xml:space="preserve">measurement: on the baseline the spread there is 1.3e-6 of the mean and the</w:t>
+      </w:r>
+      <w:r>
+        <w:t xml:space="preserve"> </w:t>
+      </w:r>
+      <w:r>
+        <w:t xml:space="preserve">log’s two definitions of frequency disagree at 1.6e-7, so the third significant</w:t>
+      </w:r>
+      <w:r>
+        <w:t xml:space="preserve"> </w:t>
+      </w:r>
+      <w:r>
+        <w:t xml:space="preserve">figure depends on which is read. The release build’s run lands at 1.5e-6</w:t>
+      </w:r>
+      <w:r>
+        <w:t xml:space="preserve"> </w:t>
+      </w:r>
+      <w:r>
+        <w:t xml:space="preserve">against the same 1.6e-7, so the same goes for it.</w:t>
       </w:r>
     </w:p>
     <w:p>
@@ -9171,19 +9221,31 @@
         <w:t xml:space="preserve">sim/spice/gono/matched_arm.py</w:t>
       </w:r>
       <w:r>
-        <w:t xml:space="preserve">.</w:t>
-      </w:r>
-      <w:r>
-        <w:t xml:space="preserve"> </w:t>
-      </w:r>
-      <w:r>
-        <w:t xml:space="preserve">The routes are the baseline’s, too. The release build drew every one of them</w:t>
-      </w:r>
-      <w:r>
-        <w:t xml:space="preserve"> </w:t>
-      </w:r>
-      <w:r>
-        <w:t xml:space="preserve">again, and the sixteen have not been run on those yet.</w:t>
+        <w:t xml:space="preserve">. The</w:t>
+      </w:r>
+      <w:r>
+        <w:t xml:space="preserve"> </w:t>
+      </w:r>
+      <w:r>
+        <w:t xml:space="preserve">routes are the baseline’s, too. The release build drew every one of them again,</w:t>
+      </w:r>
+      <w:r>
+        <w:t xml:space="preserve"> </w:t>
+      </w:r>
+      <w:r>
+        <w:t xml:space="preserve">and Section 8.1 has the sixteen run on those, but the three questions here have</w:t>
+      </w:r>
+      <w:r>
+        <w:t xml:space="preserve"> </w:t>
+      </w:r>
+      <w:r>
+        <w:t xml:space="preserve">not been asked of them. Only the first is cheap to read off the new logs, and</w:t>
+      </w:r>
+      <w:r>
+        <w:t xml:space="preserve"> </w:t>
+      </w:r>
+      <w:r>
+        <w:t xml:space="preserve">ten of sixteen still sit above the reference at tt and twelve at ff.</w:t>
       </w:r>
     </w:p>
     <w:bookmarkEnd w:id="66"/>
@@ -9482,25 +9544,31 @@
         <w:t xml:space="preserve"> </w:t>
       </w:r>
       <w:r>
-        <w:t xml:space="preserve">Section 7.1 repeated in Section 7.4, and its counter range worked out in</w:t>
-      </w:r>
-      <w:r>
-        <w:t xml:space="preserve"> </w:t>
-      </w:r>
-      <w:r>
-        <w:t xml:space="preserve">Section 5.4, and that is all. The compensation, the re-pairing, the resolution</w:t>
-      </w:r>
-      <w:r>
-        <w:t xml:space="preserve"> </w:t>
-      </w:r>
-      <w:r>
-        <w:t xml:space="preserve">floor and the Arm B instances are the baseline’s, and whether their numbers</w:t>
-      </w:r>
-      <w:r>
-        <w:t xml:space="preserve"> </w:t>
-      </w:r>
-      <w:r>
-        <w:t xml:space="preserve">carry over I have not tested yet.</w:t>
+        <w:t xml:space="preserve">Section 7.1 repeated in Section 7.4, its counter range worked out in Section</w:t>
+      </w:r>
+      <w:r>
+        <w:t xml:space="preserve"> </w:t>
+      </w:r>
+      <w:r>
+        <w:t xml:space="preserve">5.4, and its sixteen Arm B instances run on their own routes at three corners</w:t>
+      </w:r>
+      <w:r>
+        <w:t xml:space="preserve"> </w:t>
+      </w:r>
+      <w:r>
+        <w:t xml:space="preserve">in Section 8.1. The compensation, the re-pairing, the resolution floor and</w:t>
+      </w:r>
+      <w:r>
+        <w:t xml:space="preserve"> </w:t>
+      </w:r>
+      <w:r>
+        <w:t xml:space="preserve">Section 8.2’s look at what is left of Arm B are the baseline’s, and whether</w:t>
+      </w:r>
+      <w:r>
+        <w:t xml:space="preserve"> </w:t>
+      </w:r>
+      <w:r>
+        <w:t xml:space="preserve">their numbers carry over I have not tested yet.</w:t>
       </w:r>
     </w:p>
     <w:p>
@@ -9788,7 +9856,13 @@
         <w:t xml:space="preserve"> </w:t>
       </w:r>
       <w:r>
-        <w:t xml:space="preserve">same corners.</w:t>
+        <w:t xml:space="preserve">same corners. On the release build’s own routes the same run gives 0.0001%,</w:t>
+      </w:r>
+      <w:r>
+        <w:t xml:space="preserve"> </w:t>
+      </w:r>
+      <w:r>
+        <w:t xml:space="preserve">0.0033% and 0.0019% against that build’s Arm A at 5.63%, 5.73% and 5.83%.</w:t>
       </w:r>
     </w:p>
     <w:p>
@@ -9826,7 +9900,25 @@
         <w:t xml:space="preserve"> </w:t>
       </w:r>
       <w:r>
-        <w:t xml:space="preserve">MHz, though at the stopping boundary only three of the 32 paths were swept.</w:t>
+        <w:t xml:space="preserve">MHz, though at the stopping boundary only three of the 32 paths were swept. On</w:t>
+      </w:r>
+      <w:r>
+        <w:t xml:space="preserve"> </w:t>
+      </w:r>
+      <w:r>
+        <w:t xml:space="preserve">the release build the selector is 48 to 1, and at the boundary one path has</w:t>
+      </w:r>
+      <w:r>
+        <w:t xml:space="preserve"> </w:t>
+      </w:r>
+      <w:r>
+        <w:t xml:space="preserve">been swept, the slowest, in steps down to 0.2 ps, with the flop reaching a rail</w:t>
+      </w:r>
+      <w:r>
+        <w:t xml:space="preserve"> </w:t>
+      </w:r>
+      <w:r>
+        <w:t xml:space="preserve">at every phase.</w:t>
       </w:r>
     </w:p>
     <w:p>
@@ -10798,13 +10890,19 @@
         <w:t xml:space="preserve"> </w:t>
       </w:r>
       <w:r>
-        <w:t xml:space="preserve">calling 4.02 against 4.00 for guessing. Those were the baseline’s routes, and</w:t>
-      </w:r>
-      <w:r>
-        <w:t xml:space="preserve"> </w:t>
-      </w:r>
-      <w:r>
-        <w:t xml:space="preserve">the release build’s are still to be run.</w:t>
+        <w:t xml:space="preserve">calling 4.02 against 4.00 for guessing. Those were the baseline’s routes. On</w:t>
+      </w:r>
+      <w:r>
+        <w:t xml:space="preserve"> </w:t>
+      </w:r>
+      <w:r>
+        <w:t xml:space="preserve">the release build’s the sixteen spread at most 0.0033%, under one count at the</w:t>
+      </w:r>
+      <w:r>
+        <w:t xml:space="preserve"> </w:t>
+      </w:r>
+      <w:r>
+        <w:t xml:space="preserve">measurement setting, and the rest of that analysis has not been redone there.</w:t>
       </w:r>
     </w:p>
     <w:p>

</xml_diff>